<commit_message>
Remove centered/bold from XVII heading, use plain text formatting
Per user feedback: keep XVII and title as plain left-aligned text,
matching body paragraph style rather than applying heading styles.

https://claude.ai/code/session_017MrGeWNEJjofN92zBLZ8kk
</commit_message>
<xml_diff>
--- a/50_pages_corrected.docx
+++ b/50_pages_corrected.docx
@@ -8639,14 +8639,11 @@
     </w:p>
     <w:p>
       <w:pPr>
-        <w:spacing w:after="60" w:before="120" w:line="240" w:lineRule="exact"/>
-        <w:jc w:val="center"/>
-      </w:pPr>
-      <w:r>
-        <w:rPr>
-          <w:rFonts w:ascii="Times New Roman" w:cs="Times New Roman" w:eastAsia="Times New Roman" w:hAnsi="Times New Roman"/>
-          <w:b/>
-          <w:bCs/>
+        <w:spacing w:line="240" w:lineRule="exact"/>
+      </w:pPr>
+      <w:r>
+        <w:rPr>
+          <w:rFonts w:ascii="Times New Roman" w:cs="Times New Roman" w:eastAsia="Times New Roman" w:hAnsi="Times New Roman"/>
           <w:sz w:val="24"/>
           <w:szCs w:val="24"/>
         </w:rPr>
@@ -8655,14 +8652,11 @@
     </w:p>
     <w:p>
       <w:pPr>
-        <w:spacing w:after="60" w:before="120" w:line="240" w:lineRule="exact"/>
-        <w:jc w:val="center"/>
-      </w:pPr>
-      <w:r>
-        <w:rPr>
-          <w:rFonts w:ascii="Times New Roman" w:cs="Times New Roman" w:eastAsia="Times New Roman" w:hAnsi="Times New Roman"/>
-          <w:b/>
-          <w:bCs/>
+        <w:spacing w:line="240" w:lineRule="exact"/>
+      </w:pPr>
+      <w:r>
+        <w:rPr>
+          <w:rFonts w:ascii="Times New Roman" w:cs="Times New Roman" w:eastAsia="Times New Roman" w:hAnsi="Times New Roman"/>
           <w:sz w:val="24"/>
           <w:szCs w:val="24"/>
         </w:rPr>

</xml_diff>

<commit_message>
Remove centered/bold from all story headings in document
Applied plain left-aligned formatting to all 28 story number and title
headings (I through XLIX) — no centering, no bold, Times New Roman 12pt.

https://claude.ai/code/session_017MrGeWNEJjofN92zBLZ8kk
</commit_message>
<xml_diff>
--- a/50_pages_corrected.docx
+++ b/50_pages_corrected.docx
@@ -25,14 +25,11 @@
     </w:p>
     <w:p>
       <w:pPr>
-        <w:spacing w:after="60" w:before="120" w:line="240" w:lineRule="exact"/>
-        <w:jc w:val="center"/>
-      </w:pPr>
-      <w:r>
-        <w:rPr>
-          <w:rFonts w:ascii="Times New Roman" w:cs="Times New Roman" w:eastAsia="Times New Roman" w:hAnsi="Times New Roman"/>
-          <w:b/>
-          <w:bCs/>
+        <w:spacing w:line="240" w:lineRule="exact"/>
+      </w:pPr>
+      <w:r>
+        <w:rPr>
+          <w:rFonts w:ascii="Times New Roman" w:cs="Times New Roman" w:eastAsia="Times New Roman" w:hAnsi="Times New Roman"/>
           <w:sz w:val="24"/>
           <w:szCs w:val="24"/>
         </w:rPr>
@@ -41,14 +38,11 @@
     </w:p>
     <w:p>
       <w:pPr>
-        <w:spacing w:after="60" w:before="120" w:line="240" w:lineRule="exact"/>
-        <w:jc w:val="center"/>
-      </w:pPr>
-      <w:r>
-        <w:rPr>
-          <w:rFonts w:ascii="Times New Roman" w:cs="Times New Roman" w:eastAsia="Times New Roman" w:hAnsi="Times New Roman"/>
-          <w:b/>
-          <w:bCs/>
+        <w:spacing w:line="240" w:lineRule="exact"/>
+      </w:pPr>
+      <w:r>
+        <w:rPr>
+          <w:rFonts w:ascii="Times New Roman" w:cs="Times New Roman" w:eastAsia="Times New Roman" w:hAnsi="Times New Roman"/>
           <w:sz w:val="24"/>
           <w:szCs w:val="24"/>
         </w:rPr>
@@ -854,14 +848,11 @@
     </w:p>
     <w:p>
       <w:pPr>
-        <w:spacing w:after="60" w:before="120" w:line="240" w:lineRule="exact"/>
-        <w:jc w:val="center"/>
-      </w:pPr>
-      <w:r>
-        <w:rPr>
-          <w:rFonts w:ascii="Times New Roman" w:cs="Times New Roman" w:eastAsia="Times New Roman" w:hAnsi="Times New Roman"/>
-          <w:b/>
-          <w:bCs/>
+        <w:spacing w:line="240" w:lineRule="exact"/>
+      </w:pPr>
+      <w:r>
+        <w:rPr>
+          <w:rFonts w:ascii="Times New Roman" w:cs="Times New Roman" w:eastAsia="Times New Roman" w:hAnsi="Times New Roman"/>
           <w:sz w:val="24"/>
           <w:szCs w:val="24"/>
         </w:rPr>
@@ -870,14 +861,11 @@
     </w:p>
     <w:p>
       <w:pPr>
-        <w:spacing w:after="60" w:before="120" w:line="240" w:lineRule="exact"/>
-        <w:jc w:val="center"/>
-      </w:pPr>
-      <w:r>
-        <w:rPr>
-          <w:rFonts w:ascii="Times New Roman" w:cs="Times New Roman" w:eastAsia="Times New Roman" w:hAnsi="Times New Roman"/>
-          <w:b/>
-          <w:bCs/>
+        <w:spacing w:line="240" w:lineRule="exact"/>
+      </w:pPr>
+      <w:r>
+        <w:rPr>
+          <w:rFonts w:ascii="Times New Roman" w:cs="Times New Roman" w:eastAsia="Times New Roman" w:hAnsi="Times New Roman"/>
           <w:sz w:val="24"/>
           <w:szCs w:val="24"/>
         </w:rPr>
@@ -1449,14 +1437,11 @@
     </w:p>
     <w:p>
       <w:pPr>
-        <w:spacing w:after="60" w:before="120" w:line="240" w:lineRule="exact"/>
-        <w:jc w:val="center"/>
-      </w:pPr>
-      <w:r>
-        <w:rPr>
-          <w:rFonts w:ascii="Times New Roman" w:cs="Times New Roman" w:eastAsia="Times New Roman" w:hAnsi="Times New Roman"/>
-          <w:b/>
-          <w:bCs/>
+        <w:spacing w:line="240" w:lineRule="exact"/>
+      </w:pPr>
+      <w:r>
+        <w:rPr>
+          <w:rFonts w:ascii="Times New Roman" w:cs="Times New Roman" w:eastAsia="Times New Roman" w:hAnsi="Times New Roman"/>
           <w:sz w:val="24"/>
           <w:szCs w:val="24"/>
         </w:rPr>
@@ -1465,14 +1450,11 @@
     </w:p>
     <w:p>
       <w:pPr>
-        <w:spacing w:after="60" w:before="120" w:line="240" w:lineRule="exact"/>
-        <w:jc w:val="center"/>
-      </w:pPr>
-      <w:r>
-        <w:rPr>
-          <w:rFonts w:ascii="Times New Roman" w:cs="Times New Roman" w:eastAsia="Times New Roman" w:hAnsi="Times New Roman"/>
-          <w:b/>
-          <w:bCs/>
+        <w:spacing w:line="240" w:lineRule="exact"/>
+      </w:pPr>
+      <w:r>
+        <w:rPr>
+          <w:rFonts w:ascii="Times New Roman" w:cs="Times New Roman" w:eastAsia="Times New Roman" w:hAnsi="Times New Roman"/>
           <w:sz w:val="24"/>
           <w:szCs w:val="24"/>
         </w:rPr>
@@ -2458,14 +2440,11 @@
     </w:p>
     <w:p>
       <w:pPr>
-        <w:spacing w:after="60" w:before="120" w:line="240" w:lineRule="exact"/>
-        <w:jc w:val="center"/>
-      </w:pPr>
-      <w:r>
-        <w:rPr>
-          <w:rFonts w:ascii="Times New Roman" w:cs="Times New Roman" w:eastAsia="Times New Roman" w:hAnsi="Times New Roman"/>
-          <w:b/>
-          <w:bCs/>
+        <w:spacing w:line="240" w:lineRule="exact"/>
+      </w:pPr>
+      <w:r>
+        <w:rPr>
+          <w:rFonts w:ascii="Times New Roman" w:cs="Times New Roman" w:eastAsia="Times New Roman" w:hAnsi="Times New Roman"/>
           <w:sz w:val="24"/>
           <w:szCs w:val="24"/>
         </w:rPr>
@@ -2474,14 +2453,11 @@
     </w:p>
     <w:p>
       <w:pPr>
-        <w:spacing w:after="60" w:before="120" w:line="240" w:lineRule="exact"/>
-        <w:jc w:val="center"/>
-      </w:pPr>
-      <w:r>
-        <w:rPr>
-          <w:rFonts w:ascii="Times New Roman" w:cs="Times New Roman" w:eastAsia="Times New Roman" w:hAnsi="Times New Roman"/>
-          <w:b/>
-          <w:bCs/>
+        <w:spacing w:line="240" w:lineRule="exact"/>
+      </w:pPr>
+      <w:r>
+        <w:rPr>
+          <w:rFonts w:ascii="Times New Roman" w:cs="Times New Roman" w:eastAsia="Times New Roman" w:hAnsi="Times New Roman"/>
           <w:sz w:val="24"/>
           <w:szCs w:val="24"/>
         </w:rPr>
@@ -3485,14 +3461,11 @@
     </w:p>
     <w:p>
       <w:pPr>
-        <w:spacing w:after="60" w:before="120" w:line="240" w:lineRule="exact"/>
-        <w:jc w:val="center"/>
-      </w:pPr>
-      <w:r>
-        <w:rPr>
-          <w:rFonts w:ascii="Times New Roman" w:cs="Times New Roman" w:eastAsia="Times New Roman" w:hAnsi="Times New Roman"/>
-          <w:b/>
-          <w:bCs/>
+        <w:spacing w:line="240" w:lineRule="exact"/>
+      </w:pPr>
+      <w:r>
+        <w:rPr>
+          <w:rFonts w:ascii="Times New Roman" w:cs="Times New Roman" w:eastAsia="Times New Roman" w:hAnsi="Times New Roman"/>
           <w:sz w:val="24"/>
           <w:szCs w:val="24"/>
         </w:rPr>
@@ -3501,14 +3474,11 @@
     </w:p>
     <w:p>
       <w:pPr>
-        <w:spacing w:after="60" w:before="120" w:line="240" w:lineRule="exact"/>
-        <w:jc w:val="center"/>
-      </w:pPr>
-      <w:r>
-        <w:rPr>
-          <w:rFonts w:ascii="Times New Roman" w:cs="Times New Roman" w:eastAsia="Times New Roman" w:hAnsi="Times New Roman"/>
-          <w:b/>
-          <w:bCs/>
+        <w:spacing w:line="240" w:lineRule="exact"/>
+      </w:pPr>
+      <w:r>
+        <w:rPr>
+          <w:rFonts w:ascii="Times New Roman" w:cs="Times New Roman" w:eastAsia="Times New Roman" w:hAnsi="Times New Roman"/>
           <w:sz w:val="24"/>
           <w:szCs w:val="24"/>
         </w:rPr>
@@ -4476,14 +4446,11 @@
     </w:p>
     <w:p>
       <w:pPr>
-        <w:spacing w:after="60" w:before="120" w:line="240" w:lineRule="exact"/>
-        <w:jc w:val="center"/>
-      </w:pPr>
-      <w:r>
-        <w:rPr>
-          <w:rFonts w:ascii="Times New Roman" w:cs="Times New Roman" w:eastAsia="Times New Roman" w:hAnsi="Times New Roman"/>
-          <w:b/>
-          <w:bCs/>
+        <w:spacing w:line="240" w:lineRule="exact"/>
+      </w:pPr>
+      <w:r>
+        <w:rPr>
+          <w:rFonts w:ascii="Times New Roman" w:cs="Times New Roman" w:eastAsia="Times New Roman" w:hAnsi="Times New Roman"/>
           <w:sz w:val="24"/>
           <w:szCs w:val="24"/>
         </w:rPr>
@@ -4492,14 +4459,11 @@
     </w:p>
     <w:p>
       <w:pPr>
-        <w:spacing w:after="60" w:before="120" w:line="240" w:lineRule="exact"/>
-        <w:jc w:val="center"/>
-      </w:pPr>
-      <w:r>
-        <w:rPr>
-          <w:rFonts w:ascii="Times New Roman" w:cs="Times New Roman" w:eastAsia="Times New Roman" w:hAnsi="Times New Roman"/>
-          <w:b/>
-          <w:bCs/>
+        <w:spacing w:line="240" w:lineRule="exact"/>
+      </w:pPr>
+      <w:r>
+        <w:rPr>
+          <w:rFonts w:ascii="Times New Roman" w:cs="Times New Roman" w:eastAsia="Times New Roman" w:hAnsi="Times New Roman"/>
           <w:sz w:val="24"/>
           <w:szCs w:val="24"/>
         </w:rPr>
@@ -5521,14 +5485,11 @@
     </w:p>
     <w:p>
       <w:pPr>
-        <w:spacing w:after="60" w:before="120" w:line="240" w:lineRule="exact"/>
-        <w:jc w:val="center"/>
-      </w:pPr>
-      <w:r>
-        <w:rPr>
-          <w:rFonts w:ascii="Times New Roman" w:cs="Times New Roman" w:eastAsia="Times New Roman" w:hAnsi="Times New Roman"/>
-          <w:b/>
-          <w:bCs/>
+        <w:spacing w:line="240" w:lineRule="exact"/>
+      </w:pPr>
+      <w:r>
+        <w:rPr>
+          <w:rFonts w:ascii="Times New Roman" w:cs="Times New Roman" w:eastAsia="Times New Roman" w:hAnsi="Times New Roman"/>
           <w:sz w:val="24"/>
           <w:szCs w:val="24"/>
         </w:rPr>
@@ -5537,14 +5498,11 @@
     </w:p>
     <w:p>
       <w:pPr>
-        <w:spacing w:after="60" w:before="120" w:line="240" w:lineRule="exact"/>
-        <w:jc w:val="center"/>
-      </w:pPr>
-      <w:r>
-        <w:rPr>
-          <w:rFonts w:ascii="Times New Roman" w:cs="Times New Roman" w:eastAsia="Times New Roman" w:hAnsi="Times New Roman"/>
-          <w:b/>
-          <w:bCs/>
+        <w:spacing w:line="240" w:lineRule="exact"/>
+      </w:pPr>
+      <w:r>
+        <w:rPr>
+          <w:rFonts w:ascii="Times New Roman" w:cs="Times New Roman" w:eastAsia="Times New Roman" w:hAnsi="Times New Roman"/>
           <w:sz w:val="24"/>
           <w:szCs w:val="24"/>
         </w:rPr>
@@ -6440,14 +6398,11 @@
     </w:p>
     <w:p>
       <w:pPr>
-        <w:spacing w:after="60" w:before="120" w:line="240" w:lineRule="exact"/>
-        <w:jc w:val="center"/>
-      </w:pPr>
-      <w:r>
-        <w:rPr>
-          <w:rFonts w:ascii="Times New Roman" w:cs="Times New Roman" w:eastAsia="Times New Roman" w:hAnsi="Times New Roman"/>
-          <w:b/>
-          <w:bCs/>
+        <w:spacing w:line="240" w:lineRule="exact"/>
+      </w:pPr>
+      <w:r>
+        <w:rPr>
+          <w:rFonts w:ascii="Times New Roman" w:cs="Times New Roman" w:eastAsia="Times New Roman" w:hAnsi="Times New Roman"/>
           <w:sz w:val="24"/>
           <w:szCs w:val="24"/>
         </w:rPr>
@@ -6456,14 +6411,11 @@
     </w:p>
     <w:p>
       <w:pPr>
-        <w:spacing w:after="60" w:before="120" w:line="240" w:lineRule="exact"/>
-        <w:jc w:val="center"/>
-      </w:pPr>
-      <w:r>
-        <w:rPr>
-          <w:rFonts w:ascii="Times New Roman" w:cs="Times New Roman" w:eastAsia="Times New Roman" w:hAnsi="Times New Roman"/>
-          <w:b/>
-          <w:bCs/>
+        <w:spacing w:line="240" w:lineRule="exact"/>
+      </w:pPr>
+      <w:r>
+        <w:rPr>
+          <w:rFonts w:ascii="Times New Roman" w:cs="Times New Roman" w:eastAsia="Times New Roman" w:hAnsi="Times New Roman"/>
           <w:sz w:val="24"/>
           <w:szCs w:val="24"/>
         </w:rPr>
@@ -7125,14 +7077,11 @@
     </w:p>
     <w:p>
       <w:pPr>
-        <w:spacing w:after="60" w:before="120" w:line="240" w:lineRule="exact"/>
-        <w:jc w:val="center"/>
-      </w:pPr>
-      <w:r>
-        <w:rPr>
-          <w:rFonts w:ascii="Times New Roman" w:cs="Times New Roman" w:eastAsia="Times New Roman" w:hAnsi="Times New Roman"/>
-          <w:b/>
-          <w:bCs/>
+        <w:spacing w:line="240" w:lineRule="exact"/>
+      </w:pPr>
+      <w:r>
+        <w:rPr>
+          <w:rFonts w:ascii="Times New Roman" w:cs="Times New Roman" w:eastAsia="Times New Roman" w:hAnsi="Times New Roman"/>
           <w:sz w:val="24"/>
           <w:szCs w:val="24"/>
         </w:rPr>
@@ -7141,14 +7090,11 @@
     </w:p>
     <w:p>
       <w:pPr>
-        <w:spacing w:after="60" w:before="120" w:line="240" w:lineRule="exact"/>
-        <w:jc w:val="center"/>
-      </w:pPr>
-      <w:r>
-        <w:rPr>
-          <w:rFonts w:ascii="Times New Roman" w:cs="Times New Roman" w:eastAsia="Times New Roman" w:hAnsi="Times New Roman"/>
-          <w:b/>
-          <w:bCs/>
+        <w:spacing w:line="240" w:lineRule="exact"/>
+      </w:pPr>
+      <w:r>
+        <w:rPr>
+          <w:rFonts w:ascii="Times New Roman" w:cs="Times New Roman" w:eastAsia="Times New Roman" w:hAnsi="Times New Roman"/>
           <w:sz w:val="24"/>
           <w:szCs w:val="24"/>
         </w:rPr>
@@ -7828,14 +7774,11 @@
     </w:p>
     <w:p>
       <w:pPr>
-        <w:spacing w:after="60" w:before="120" w:line="240" w:lineRule="exact"/>
-        <w:jc w:val="center"/>
-      </w:pPr>
-      <w:r>
-        <w:rPr>
-          <w:rFonts w:ascii="Times New Roman" w:cs="Times New Roman" w:eastAsia="Times New Roman" w:hAnsi="Times New Roman"/>
-          <w:b/>
-          <w:bCs/>
+        <w:spacing w:line="240" w:lineRule="exact"/>
+      </w:pPr>
+      <w:r>
+        <w:rPr>
+          <w:rFonts w:ascii="Times New Roman" w:cs="Times New Roman" w:eastAsia="Times New Roman" w:hAnsi="Times New Roman"/>
           <w:sz w:val="24"/>
           <w:szCs w:val="24"/>
         </w:rPr>
@@ -7844,14 +7787,11 @@
     </w:p>
     <w:p>
       <w:pPr>
-        <w:spacing w:after="60" w:before="120" w:line="240" w:lineRule="exact"/>
-        <w:jc w:val="center"/>
-      </w:pPr>
-      <w:r>
-        <w:rPr>
-          <w:rFonts w:ascii="Times New Roman" w:cs="Times New Roman" w:eastAsia="Times New Roman" w:hAnsi="Times New Roman"/>
-          <w:b/>
-          <w:bCs/>
+        <w:spacing w:line="240" w:lineRule="exact"/>
+      </w:pPr>
+      <w:r>
+        <w:rPr>
+          <w:rFonts w:ascii="Times New Roman" w:cs="Times New Roman" w:eastAsia="Times New Roman" w:hAnsi="Times New Roman"/>
           <w:sz w:val="24"/>
           <w:szCs w:val="24"/>
         </w:rPr>
@@ -8771,14 +8711,11 @@
     </w:p>
     <w:p>
       <w:pPr>
-        <w:spacing w:after="60" w:before="120" w:line="240" w:lineRule="exact"/>
-        <w:jc w:val="center"/>
-      </w:pPr>
-      <w:r>
-        <w:rPr>
-          <w:rFonts w:ascii="Times New Roman" w:cs="Times New Roman" w:eastAsia="Times New Roman" w:hAnsi="Times New Roman"/>
-          <w:b/>
-          <w:bCs/>
+        <w:spacing w:line="240" w:lineRule="exact"/>
+      </w:pPr>
+      <w:r>
+        <w:rPr>
+          <w:rFonts w:ascii="Times New Roman" w:cs="Times New Roman" w:eastAsia="Times New Roman" w:hAnsi="Times New Roman"/>
           <w:sz w:val="24"/>
           <w:szCs w:val="24"/>
         </w:rPr>
@@ -8787,14 +8724,11 @@
     </w:p>
     <w:p>
       <w:pPr>
-        <w:spacing w:after="60" w:before="120" w:line="240" w:lineRule="exact"/>
-        <w:jc w:val="center"/>
-      </w:pPr>
-      <w:r>
-        <w:rPr>
-          <w:rFonts w:ascii="Times New Roman" w:cs="Times New Roman" w:eastAsia="Times New Roman" w:hAnsi="Times New Roman"/>
-          <w:b/>
-          <w:bCs/>
+        <w:spacing w:line="240" w:lineRule="exact"/>
+      </w:pPr>
+      <w:r>
+        <w:rPr>
+          <w:rFonts w:ascii="Times New Roman" w:cs="Times New Roman" w:eastAsia="Times New Roman" w:hAnsi="Times New Roman"/>
           <w:sz w:val="24"/>
           <w:szCs w:val="24"/>
         </w:rPr>
@@ -9798,14 +9732,11 @@
     </w:p>
     <w:p>
       <w:pPr>
-        <w:spacing w:after="60" w:before="120" w:line="240" w:lineRule="exact"/>
-        <w:jc w:val="center"/>
-      </w:pPr>
-      <w:r>
-        <w:rPr>
-          <w:rFonts w:ascii="Times New Roman" w:cs="Times New Roman" w:eastAsia="Times New Roman" w:hAnsi="Times New Roman"/>
-          <w:b/>
-          <w:bCs/>
+        <w:spacing w:line="240" w:lineRule="exact"/>
+      </w:pPr>
+      <w:r>
+        <w:rPr>
+          <w:rFonts w:ascii="Times New Roman" w:cs="Times New Roman" w:eastAsia="Times New Roman" w:hAnsi="Times New Roman"/>
           <w:sz w:val="24"/>
           <w:szCs w:val="24"/>
         </w:rPr>
@@ -9814,14 +9745,11 @@
     </w:p>
     <w:p>
       <w:pPr>
-        <w:spacing w:after="60" w:before="120" w:line="240" w:lineRule="exact"/>
-        <w:jc w:val="center"/>
-      </w:pPr>
-      <w:r>
-        <w:rPr>
-          <w:rFonts w:ascii="Times New Roman" w:cs="Times New Roman" w:eastAsia="Times New Roman" w:hAnsi="Times New Roman"/>
-          <w:b/>
-          <w:bCs/>
+        <w:spacing w:line="240" w:lineRule="exact"/>
+      </w:pPr>
+      <w:r>
+        <w:rPr>
+          <w:rFonts w:ascii="Times New Roman" w:cs="Times New Roman" w:eastAsia="Times New Roman" w:hAnsi="Times New Roman"/>
           <w:sz w:val="24"/>
           <w:szCs w:val="24"/>
         </w:rPr>
@@ -10843,14 +10771,11 @@
     </w:p>
     <w:p>
       <w:pPr>
-        <w:spacing w:after="60" w:before="120" w:line="240" w:lineRule="exact"/>
-        <w:jc w:val="center"/>
-      </w:pPr>
-      <w:r>
-        <w:rPr>
-          <w:rFonts w:ascii="Times New Roman" w:cs="Times New Roman" w:eastAsia="Times New Roman" w:hAnsi="Times New Roman"/>
-          <w:b/>
-          <w:bCs/>
+        <w:spacing w:line="240" w:lineRule="exact"/>
+      </w:pPr>
+      <w:r>
+        <w:rPr>
+          <w:rFonts w:ascii="Times New Roman" w:cs="Times New Roman" w:eastAsia="Times New Roman" w:hAnsi="Times New Roman"/>
           <w:sz w:val="24"/>
           <w:szCs w:val="24"/>
         </w:rPr>
@@ -10859,14 +10784,11 @@
     </w:p>
     <w:p>
       <w:pPr>
-        <w:spacing w:after="60" w:before="120" w:line="240" w:lineRule="exact"/>
-        <w:jc w:val="center"/>
-      </w:pPr>
-      <w:r>
-        <w:rPr>
-          <w:rFonts w:ascii="Times New Roman" w:cs="Times New Roman" w:eastAsia="Times New Roman" w:hAnsi="Times New Roman"/>
-          <w:b/>
-          <w:bCs/>
+        <w:spacing w:line="240" w:lineRule="exact"/>
+      </w:pPr>
+      <w:r>
+        <w:rPr>
+          <w:rFonts w:ascii="Times New Roman" w:cs="Times New Roman" w:eastAsia="Times New Roman" w:hAnsi="Times New Roman"/>
           <w:sz w:val="24"/>
           <w:szCs w:val="24"/>
         </w:rPr>
@@ -11096,14 +11018,11 @@
     </w:p>
     <w:p>
       <w:pPr>
-        <w:spacing w:after="60" w:before="120" w:line="240" w:lineRule="exact"/>
-        <w:jc w:val="center"/>
-      </w:pPr>
-      <w:r>
-        <w:rPr>
-          <w:rFonts w:ascii="Times New Roman" w:cs="Times New Roman" w:eastAsia="Times New Roman" w:hAnsi="Times New Roman"/>
-          <w:b/>
-          <w:bCs/>
+        <w:spacing w:line="240" w:lineRule="exact"/>
+      </w:pPr>
+      <w:r>
+        <w:rPr>
+          <w:rFonts w:ascii="Times New Roman" w:cs="Times New Roman" w:eastAsia="Times New Roman" w:hAnsi="Times New Roman"/>
           <w:sz w:val="24"/>
           <w:szCs w:val="24"/>
         </w:rPr>
@@ -11112,14 +11031,11 @@
     </w:p>
     <w:p>
       <w:pPr>
-        <w:spacing w:after="60" w:before="120" w:line="240" w:lineRule="exact"/>
-        <w:jc w:val="center"/>
-      </w:pPr>
-      <w:r>
-        <w:rPr>
-          <w:rFonts w:ascii="Times New Roman" w:cs="Times New Roman" w:eastAsia="Times New Roman" w:hAnsi="Times New Roman"/>
-          <w:b/>
-          <w:bCs/>
+        <w:spacing w:line="240" w:lineRule="exact"/>
+      </w:pPr>
+      <w:r>
+        <w:rPr>
+          <w:rFonts w:ascii="Times New Roman" w:cs="Times New Roman" w:eastAsia="Times New Roman" w:hAnsi="Times New Roman"/>
           <w:sz w:val="24"/>
           <w:szCs w:val="24"/>
         </w:rPr>

</xml_diff>

<commit_message>
Add all missing content found by thorough PDF vs DOCX audit
- All 68 'O HENRY - 100 SELECTED STORIES [page]' running headers
- Story XV ending (The Romance of a Busy Broker, page 74)
- Story XVII full content (The Brief Debut of Tildy, pages 80 & 178)
- Story XLVI ending snippet (page 286)
- Missing paragraph from Story XLVIII (page 297)
- Two decorative section dividers (stories IV and XVI)

https://claude.ai/code/session_017MrGeWNEJjofN92zBLZ8kk
</commit_message>
<xml_diff>
--- a/50_pages_corrected.docx
+++ b/50_pages_corrected.docx
@@ -154,6 +154,19 @@
           <w:sz w:val="24"/>
           <w:szCs w:val="24"/>
         </w:rPr>
+        <w:t xml:space="preserve">O HENRY - 100 SELECTED STORIES</w:t>
+      </w:r>
+    </w:p>
+    <w:p>
+      <w:pPr>
+        <w:spacing w:line="240" w:lineRule="exact"/>
+      </w:pPr>
+      <w:r>
+        <w:rPr>
+          <w:rFonts w:ascii="Times New Roman" w:cs="Times New Roman" w:eastAsia="Times New Roman" w:hAnsi="Times New Roman"/>
+          <w:sz w:val="24"/>
+          <w:szCs w:val="24"/>
+        </w:rPr>
         <w:t xml:space="preserve">Della finished her cry and attended to her cheeks with the powder rag. She stood by the window and looked out dully at a grey cat walking a grey fence in a grey backyard. To-morrow would be Christmas Day, and she had only $1.87 with which to buy Jim a present. She had been saving every penny she could for months, with this result. Twenty dollars a week doesn't go far. Expenses had been greater than she had calculated. They always are. Only $1.87 to buy a present for Jim. Her Jim. Many a happy hour she had spent planning for something nice for him. Something fine and rare and sterling - something just a little bit near to being worthy of the honour of being owned by Jim.</w:t>
       </w:r>
     </w:p>
@@ -352,6 +365,19 @@
           <w:sz w:val="24"/>
           <w:szCs w:val="24"/>
         </w:rPr>
+        <w:t xml:space="preserve">O HENRY - 100 SELECTED STORIES 3</w:t>
+      </w:r>
+    </w:p>
+    <w:p>
+      <w:pPr>
+        <w:spacing w:line="240" w:lineRule="exact"/>
+      </w:pPr>
+      <w:r>
+        <w:rPr>
+          <w:rFonts w:ascii="Times New Roman" w:cs="Times New Roman" w:eastAsia="Times New Roman" w:hAnsi="Times New Roman"/>
+          <w:sz w:val="24"/>
+          <w:szCs w:val="24"/>
+        </w:rPr>
         <w:t xml:space="preserve">'Give it to me quick,' said Della.</w:t>
       </w:r>
     </w:p>
@@ -514,6 +540,19 @@
           <w:sz w:val="24"/>
           <w:szCs w:val="24"/>
         </w:rPr>
+        <w:t xml:space="preserve">4 O HENRY - 100 SELECTED STORIES</w:t>
+      </w:r>
+    </w:p>
+    <w:p>
+      <w:pPr>
+        <w:spacing w:line="240" w:lineRule="exact"/>
+      </w:pPr>
+      <w:r>
+        <w:rPr>
+          <w:rFonts w:ascii="Times New Roman" w:cs="Times New Roman" w:eastAsia="Times New Roman" w:hAnsi="Times New Roman"/>
+          <w:sz w:val="24"/>
+          <w:szCs w:val="24"/>
+        </w:rPr>
         <w:t xml:space="preserve">Jim stepped inside the door, as immovable as a setter at the scent of quail. His eyes were fixed upon Della, and there was an expression in them that she could not read, and it terrified her. It was not anger, nor surprise, nor disapproval, nor horror, nor any of the sentiments that she had been prepared for. He simply stared at her fixedly with that peculiar expression on his face.</w:t>
       </w:r>
     </w:p>
@@ -712,6 +751,19 @@
           <w:sz w:val="24"/>
           <w:szCs w:val="24"/>
         </w:rPr>
+        <w:t xml:space="preserve">O HENRY - 100 SELECTED STORIES 5</w:t>
+      </w:r>
+    </w:p>
+    <w:p>
+      <w:pPr>
+        <w:spacing w:line="240" w:lineRule="exact"/>
+      </w:pPr>
+      <w:r>
+        <w:rPr>
+          <w:rFonts w:ascii="Times New Roman" w:cs="Times New Roman" w:eastAsia="Times New Roman" w:hAnsi="Times New Roman"/>
+          <w:sz w:val="24"/>
+          <w:szCs w:val="24"/>
+        </w:rPr>
         <w:t xml:space="preserve">For there lay The Combs - the set of combs, side and back, that Della had worshipped for long in a Broadway window. Beautiful combs, pure tortoiseshell, with jewelled rims - just the shade to wear in the beautiful vanished hair. They were expensive combs, she knew, and her heart had simply craved and yearned over them without the least hope of possession. And now they were hers, but the tresses that should have adorned the coveted adornments were gone.</w:t>
       </w:r>
     </w:p>
@@ -856,6 +908,19 @@
           <w:sz w:val="24"/>
           <w:szCs w:val="24"/>
         </w:rPr>
+        <w:t xml:space="preserve">6 O HENRY - 100 SELECTED STORIES</w:t>
+      </w:r>
+    </w:p>
+    <w:p>
+      <w:pPr>
+        <w:spacing w:line="240" w:lineRule="exact"/>
+      </w:pPr>
+      <w:r>
+        <w:rPr>
+          <w:rFonts w:ascii="Times New Roman" w:cs="Times New Roman" w:eastAsia="Times New Roman" w:hAnsi="Times New Roman"/>
+          <w:sz w:val="24"/>
+          <w:szCs w:val="24"/>
+        </w:rPr>
         <w:t xml:space="preserve">II</w:t>
       </w:r>
     </w:p>
@@ -941,6 +1006,19 @@
           <w:sz w:val="24"/>
           <w:szCs w:val="24"/>
         </w:rPr>
+        <w:t xml:space="preserve">O HENRY - 100 SELECTED STORIES 7</w:t>
+      </w:r>
+    </w:p>
+    <w:p>
+      <w:pPr>
+        <w:spacing w:line="240" w:lineRule="exact"/>
+      </w:pPr>
+      <w:r>
+        <w:rPr>
+          <w:rFonts w:ascii="Times New Roman" w:cs="Times New Roman" w:eastAsia="Times New Roman" w:hAnsi="Times New Roman"/>
+          <w:sz w:val="24"/>
+          <w:szCs w:val="24"/>
+        </w:rPr>
         <w:t xml:space="preserve">My cosmopolite was named E. Rushmore Coglan, and he will be heard from next summer at Coney Island. He is to establish a new 'attraction' there, he informed me, offering kingly diversion. And then his conversation rang along parallels of latitude and longitude. He took the great, round world in his hand, so to speak, familiarly, contemptuously, and it seemed no larger than the seed of a Maraschino cherry in a table-d'hôte grape fruit. He spoke disrespectfully of the equator, he skipped from continent to continent, he derided the zones, he mopped up the high seas with his napkin. With a wave of his hand he would speak of a certain bazaar in Hyderabad. Whiff! He would have you on skis in Lapland. Zip! Now you rode the breakers with the Kanakas at Kealaikahiki. Presto! He dragged you through an Arkansas post-oak swamp, let you dry for a moment on the alkali plains of his Idaho ranch, then whirled you into the society of Viennese archdukes. Anon he would be telling you of a cold he acquired in a Chicago lake breeze and how old Escamila cured it in Buenos Ayres with a hot infusion of the chuchula weed. You would have addressed the letter to 'E. Rushmore Coglan, Esq., the Earth, Solar System, the Universe,' and have mailed it, feeling confident that it would be delivered to him.</w:t>
       </w:r>
     </w:p>
@@ -1031,6 +1109,19 @@
           <w:sz w:val="24"/>
           <w:szCs w:val="24"/>
         </w:rPr>
+        <w:t xml:space="preserve">8 O HENRY - 100 SELECTED STORIES</w:t>
+      </w:r>
+    </w:p>
+    <w:p>
+      <w:pPr>
+        <w:spacing w:line="240" w:lineRule="exact"/>
+      </w:pPr>
+      <w:r>
+        <w:rPr>
+          <w:rFonts w:ascii="Times New Roman" w:cs="Times New Roman" w:eastAsia="Times New Roman" w:hAnsi="Times New Roman"/>
+          <w:sz w:val="24"/>
+          <w:szCs w:val="24"/>
+        </w:rPr>
         <w:t xml:space="preserve">When 'Dixie' was being played a dark-haired young man sprang up from somewhere with a Mosby guerrilla yell and waved frantically his soft-brimmed hat. Then he strayed through the smoke, dropped into the vacant chair at our table and pulled out cigarettes.</w:t>
       </w:r>
     </w:p>
@@ -1193,6 +1284,19 @@
           <w:sz w:val="24"/>
           <w:szCs w:val="24"/>
         </w:rPr>
+        <w:t xml:space="preserve">O HENRY - 100 SELECTED STORIES 9</w:t>
+      </w:r>
+    </w:p>
+    <w:p>
+      <w:pPr>
+        <w:spacing w:line="240" w:lineRule="exact"/>
+      </w:pPr>
+      <w:r>
+        <w:rPr>
+          <w:rFonts w:ascii="Times New Roman" w:cs="Times New Roman" w:eastAsia="Times New Roman" w:hAnsi="Times New Roman"/>
+          <w:sz w:val="24"/>
+          <w:szCs w:val="24"/>
+        </w:rPr>
         <w:t xml:space="preserve">'I've been around the world twelve times,' said he. 'I know an Esquimau in Upernavik who sends to Cincinnati for his neckties, and I saw a goat-herder in Uruguay who won a prize in a Battle Creek breakfast-food puzzle competition. I pay rent on a room in Cairo, Egypt, and another in Yokohama all the year round. I've got slippers waiting for me in a tea-house in Shanghai, and I don't have to tell 'em how to cook my eggs in Rio de Janeiro or Seattle. It's a mighty little old world. What's the use of bragging about being from the North, or the South, or the old manor-house in the dale, or Euclid Avenue, Cleveland, or Pike's Peak, or Fairfax County, Va., or Hooligan's Flats or any place? It'll be a better world when we quit being fools about some mildewed town or ten acres of swampland just because we happened to be born there.'</w:t>
       </w:r>
     </w:p>
@@ -1301,6 +1405,19 @@
           <w:sz w:val="24"/>
           <w:szCs w:val="24"/>
         </w:rPr>
+        <w:t xml:space="preserve">10 O HENRY - 100 SELECTED STORIES</w:t>
+      </w:r>
+    </w:p>
+    <w:p>
+      <w:pPr>
+        <w:spacing w:line="240" w:lineRule="exact"/>
+      </w:pPr>
+      <w:r>
+        <w:rPr>
+          <w:rFonts w:ascii="Times New Roman" w:cs="Times New Roman" w:eastAsia="Times New Roman" w:hAnsi="Times New Roman"/>
+          <w:sz w:val="24"/>
+          <w:szCs w:val="24"/>
+        </w:rPr>
         <w:t xml:space="preserve">I sat reflecting upon my evident cosmopolite and wondering how the poet had managed to miss him. He was my discovery and I believed in him. How was it? 'The men that breed from them they traffic up and down, but cling to their cities' hem as a child to the mother's gown.'</w:t>
       </w:r>
     </w:p>
@@ -1512,6 +1629,19 @@
           <w:sz w:val="24"/>
           <w:szCs w:val="24"/>
         </w:rPr>
+        <w:t xml:space="preserve">O HENRY - 100 SELECTED STORIES 11</w:t>
+      </w:r>
+    </w:p>
+    <w:p>
+      <w:pPr>
+        <w:spacing w:line="240" w:lineRule="exact"/>
+      </w:pPr>
+      <w:r>
+        <w:rPr>
+          <w:rFonts w:ascii="Times New Roman" w:cs="Times New Roman" w:eastAsia="Times New Roman" w:hAnsi="Times New Roman"/>
+          <w:sz w:val="24"/>
+          <w:szCs w:val="24"/>
+        </w:rPr>
         <w:t xml:space="preserve">In one of the second-floor front windows Mrs. McCaskey awaited her husband. Supper was cooling on the table. Its heat went into Mrs. McCaskey.</w:t>
       </w:r>
     </w:p>
@@ -1674,6 +1804,19 @@
           <w:sz w:val="24"/>
           <w:szCs w:val="24"/>
         </w:rPr>
+        <w:t xml:space="preserve">12 O HENRY - 100 SELECTED STORIES</w:t>
+      </w:r>
+    </w:p>
+    <w:p>
+      <w:pPr>
+        <w:spacing w:line="240" w:lineRule="exact"/>
+      </w:pPr>
+      <w:r>
+        <w:rPr>
+          <w:rFonts w:ascii="Times New Roman" w:cs="Times New Roman" w:eastAsia="Times New Roman" w:hAnsi="Times New Roman"/>
+          <w:sz w:val="24"/>
+          <w:szCs w:val="24"/>
+        </w:rPr>
         <w:t xml:space="preserve">But Mr. McCaskey was no 50 cent table d'hôter. Let cheap Bohemians consider coffee the end, if they would. Let them make that faux pas. He was foxier still. Finger-bowls were not beyond the compass of his experience. They were not to be had in the Pension Murphy; but their equivalent was at hand. Triumphantly he sent the granite-ware wash-basin at the head of his matrimonial adversary. Mrs. McCaskey dodged in time. She reached for a flat-iron, with which, as a sort of cordial, she hoped to bring the gastronomical duel to a close. But a loud, wailing scream downstairs caused both her and Mr. McCaskey to pause in a sort of involuntary armistice.</w:t>
       </w:r>
     </w:p>
@@ -1800,6 +1943,19 @@
           <w:sz w:val="24"/>
           <w:szCs w:val="24"/>
         </w:rPr>
+        <w:t xml:space="preserve">O HENRY - 100 SELECTED STORIES 13</w:t>
+      </w:r>
+    </w:p>
+    <w:p>
+      <w:pPr>
+        <w:spacing w:line="240" w:lineRule="exact"/>
+      </w:pPr>
+      <w:r>
+        <w:rPr>
+          <w:rFonts w:ascii="Times New Roman" w:cs="Times New Roman" w:eastAsia="Times New Roman" w:hAnsi="Times New Roman"/>
+          <w:sz w:val="24"/>
+          <w:szCs w:val="24"/>
+        </w:rPr>
         <w:t xml:space="preserve">'When'd ye see him last?' asked old man Denny, with one eye on the report of the Building Trades League.</w:t>
       </w:r>
     </w:p>
@@ -1998,6 +2154,19 @@
           <w:sz w:val="24"/>
           <w:szCs w:val="24"/>
         </w:rPr>
+        <w:t xml:space="preserve">14 O HENRY - 100 SELECTED STORIES</w:t>
+      </w:r>
+    </w:p>
+    <w:p>
+      <w:pPr>
+        <w:spacing w:line="240" w:lineRule="exact"/>
+      </w:pPr>
+      <w:r>
+        <w:rPr>
+          <w:rFonts w:ascii="Times New Roman" w:cs="Times New Roman" w:eastAsia="Times New Roman" w:hAnsi="Times New Roman"/>
+          <w:sz w:val="24"/>
+          <w:szCs w:val="24"/>
+        </w:rPr>
         <w:t xml:space="preserve">'The bit of a boy mislaid?' said Mr. McCaskey leaning out of the window. 'Why, now, that's bad enough, entirely. The childer, they be different. If 'twas a woman I'd be willin', for they leave peace behind 'em when they go.'</w:t>
       </w:r>
     </w:p>
@@ -2268,6 +2437,19 @@
           <w:sz w:val="24"/>
           <w:szCs w:val="24"/>
         </w:rPr>
+        <w:t xml:space="preserve">O HENRY - 100 SELECTED STORIES 15</w:t>
+      </w:r>
+    </w:p>
+    <w:p>
+      <w:pPr>
+        <w:spacing w:line="240" w:lineRule="exact"/>
+      </w:pPr>
+      <w:r>
+        <w:rPr>
+          <w:rFonts w:ascii="Times New Roman" w:cs="Times New Roman" w:eastAsia="Times New Roman" w:hAnsi="Times New Roman"/>
+          <w:sz w:val="24"/>
+          <w:szCs w:val="24"/>
+        </w:rPr>
         <w:t xml:space="preserve">Loud voices and a renewed uproar were raised in front of the boarding-house.</w:t>
       </w:r>
     </w:p>
@@ -2497,6 +2679,19 @@
           <w:sz w:val="24"/>
           <w:szCs w:val="24"/>
         </w:rPr>
+        <w:t xml:space="preserve">16 O HENRY - 100 SELECTED STORIES</w:t>
+      </w:r>
+    </w:p>
+    <w:p>
+      <w:pPr>
+        <w:spacing w:line="240" w:lineRule="exact"/>
+      </w:pPr>
+      <w:r>
+        <w:rPr>
+          <w:rFonts w:ascii="Times New Roman" w:cs="Times New Roman" w:eastAsia="Times New Roman" w:hAnsi="Times New Roman"/>
+          <w:sz w:val="24"/>
+          <w:szCs w:val="24"/>
+        </w:rPr>
         <w:t xml:space="preserve">Next you ascended one flight of stairs and looked at the second floor back at $8. Convinced by her second-floor manner that it was worth the $12 that Mr. Toosenberry always paid for it until he left to take charge of his brother's orange plantation in Florida near Palm Beach, where Mrs. McIntyre always spent the winters that had the double front room with private bath, you managed to babble that you wanted something still cheaper.</w:t>
       </w:r>
     </w:p>
@@ -2659,6 +2854,19 @@
           <w:sz w:val="24"/>
           <w:szCs w:val="24"/>
         </w:rPr>
+        <w:t xml:space="preserve">O HENRY - 100 SELECTED STORIES 17</w:t>
+      </w:r>
+    </w:p>
+    <w:p>
+      <w:pPr>
+        <w:spacing w:line="240" w:lineRule="exact"/>
+      </w:pPr>
+      <w:r>
+        <w:rPr>
+          <w:rFonts w:ascii="Times New Roman" w:cs="Times New Roman" w:eastAsia="Times New Roman" w:hAnsi="Times New Roman"/>
+          <w:sz w:val="24"/>
+          <w:szCs w:val="24"/>
+        </w:rPr>
         <w:t xml:space="preserve">'Eight dollars?' said Miss Leeson. 'Dear me! I'm not Hetty if I do look green. I'm just a poor little working girl. Show me something higher and lower.'</w:t>
       </w:r>
     </w:p>
@@ -2839,6 +3047,19 @@
           <w:sz w:val="24"/>
           <w:szCs w:val="24"/>
         </w:rPr>
+        <w:t xml:space="preserve">18 O HENRY - 100 SELECTED STORIES</w:t>
+      </w:r>
+    </w:p>
+    <w:p>
+      <w:pPr>
+        <w:spacing w:line="240" w:lineRule="exact"/>
+      </w:pPr>
+      <w:r>
+        <w:rPr>
+          <w:rFonts w:ascii="Times New Roman" w:cs="Times New Roman" w:eastAsia="Times New Roman" w:hAnsi="Times New Roman"/>
+          <w:sz w:val="24"/>
+          <w:szCs w:val="24"/>
+        </w:rPr>
         <w:t xml:space="preserve">Especially Mr. Skidder, who had cast her in his mind for the star part in a private, romantic (unspoken) drama in real life. And especially Mr. Hoover, who was forty-five, fat, flushed and foolish. And especially very young Mr. Evans, who set up a hollow cough to induce her to ask him to leave off cigarettes. The men voted her 'the funniest and jolliest ever,' but the sniffs on the top step and the lower step were implacable.</w:t>
       </w:r>
     </w:p>
@@ -2857,6 +3078,19 @@
           <w:sz w:val="24"/>
           <w:szCs w:val="24"/>
         </w:rPr>
+        <w:t xml:space="preserve">•••••</w:t>
+      </w:r>
+    </w:p>
+    <w:p>
+      <w:pPr>
+        <w:spacing w:line="240" w:lineRule="exact"/>
+      </w:pPr>
+      <w:r>
+        <w:rPr>
+          <w:rFonts w:ascii="Times New Roman" w:cs="Times New Roman" w:eastAsia="Times New Roman" w:hAnsi="Times New Roman"/>
+          <w:sz w:val="24"/>
+          <w:szCs w:val="24"/>
+        </w:rPr>
         <w:t xml:space="preserve">I pray you let the drama halt while Chorus stalks to the footlights and drops an epicedian tear upon the fatness of Mr. Hoover. Tune the pipes to the tragedy of tallow, the bane of bulk, the calamity of corpulence. Tried out, Falstaff might have rendered more romance to the ton than would have Romeo's rickety ribs to the ounce. A lover may sigh, but he must not puff. To the train of Momus are the fat men remanded. In vain beats the faithfullest heart above a 52-inch belt. Avaunt, Hoover! Hoover, forty-five, flush and foolish, might carry off Helen herself; Hoover, forty-five, flush, foolish and fat, is meat for perdition. There was never a chance for you, Hoover.</w:t>
       </w:r>
     </w:p>
@@ -2947,6 +3181,19 @@
           <w:sz w:val="24"/>
           <w:szCs w:val="24"/>
         </w:rPr>
+        <w:t xml:space="preserve">O HENRY - 100 SELECTED STORIES 19</w:t>
+      </w:r>
+    </w:p>
+    <w:p>
+      <w:pPr>
+        <w:spacing w:line="240" w:lineRule="exact"/>
+      </w:pPr>
+      <w:r>
+        <w:rPr>
+          <w:rFonts w:ascii="Times New Roman" w:cs="Times New Roman" w:eastAsia="Times New Roman" w:hAnsi="Times New Roman"/>
+          <w:sz w:val="24"/>
+          <w:szCs w:val="24"/>
+        </w:rPr>
         <w:t xml:space="preserve">'Well, really!' said Miss Longnecker. 'I didn't know you were an astronomer, Miss Leeson.'</w:t>
       </w:r>
     </w:p>
@@ -3199,6 +3446,19 @@
           <w:sz w:val="24"/>
           <w:szCs w:val="24"/>
         </w:rPr>
+        <w:t xml:space="preserve">20 O HENRY - 100 SELECTED STORIES</w:t>
+      </w:r>
+    </w:p>
+    <w:p>
+      <w:pPr>
+        <w:spacing w:line="240" w:lineRule="exact"/>
+      </w:pPr>
+      <w:r>
+        <w:rPr>
+          <w:rFonts w:ascii="Times New Roman" w:cs="Times New Roman" w:eastAsia="Times New Roman" w:hAnsi="Times New Roman"/>
+          <w:sz w:val="24"/>
+          <w:szCs w:val="24"/>
+        </w:rPr>
         <w:t xml:space="preserve">'Good-bye, Billy,' she murmured faintly. 'You're millions of miles away and you won't even twinkle once. But you kept where I could see you most of the time up there when there wasn't anything else but darkness to look at, didn't you? . . . Millions of miles.... Good-bye, Billy Jackson.'</w:t>
       </w:r>
     </w:p>
@@ -3433,6 +3693,19 @@
           <w:sz w:val="24"/>
           <w:szCs w:val="24"/>
         </w:rPr>
+        <w:t xml:space="preserve">O HENRY - 100 SELECTED STORIES 21</w:t>
+      </w:r>
+    </w:p>
+    <w:p>
+      <w:pPr>
+        <w:spacing w:line="240" w:lineRule="exact"/>
+      </w:pPr>
+      <w:r>
+        <w:rPr>
+          <w:rFonts w:ascii="Times New Roman" w:cs="Times New Roman" w:eastAsia="Times New Roman" w:hAnsi="Times New Roman"/>
+          <w:sz w:val="24"/>
+          <w:szCs w:val="24"/>
+        </w:rPr>
         <w:t xml:space="preserve">It recounted the reception into Bellevue Hospital of a young woman who had been removed from No. 49 East - Street, suffering from debility induced by starvation. It concluded with these words:</w:t>
       </w:r>
     </w:p>
@@ -3626,6 +3899,19 @@
           <w:sz w:val="24"/>
           <w:szCs w:val="24"/>
         </w:rPr>
+        <w:t xml:space="preserve">22 O HENRY - 100 SELECTED STORIES</w:t>
+      </w:r>
+    </w:p>
+    <w:p>
+      <w:pPr>
+        <w:spacing w:line="240" w:lineRule="exact"/>
+      </w:pPr>
+      <w:r>
+        <w:rPr>
+          <w:rFonts w:ascii="Times New Roman" w:cs="Times New Roman" w:eastAsia="Times New Roman" w:hAnsi="Times New Roman"/>
+          <w:sz w:val="24"/>
+          <w:szCs w:val="24"/>
+        </w:rPr>
         <w:t xml:space="preserve">Flat-dwellers shall endorse my dictum that theirs is the only true happiness. If a home is happy it cannot fit too close - let the dresser collapse and become a billiard table; let the mantel turn to a rowing machine, the escritoire to a spare bedchamber, the wash-stand to an upright piano; let the four walls come together, if they will, so you and your Delia are between. But if home be the other kind, let it be wide and long - enter you at the Golden Gate, hang your hat on Hatteras, your cape on Cape Horn, and go out by Labrador.</w:t>
       </w:r>
     </w:p>
@@ -3752,6 +4038,19 @@
           <w:sz w:val="24"/>
           <w:szCs w:val="24"/>
         </w:rPr>
+        <w:t xml:space="preserve">O HENRY - 100 SELECTED STORIES 23</w:t>
+      </w:r>
+    </w:p>
+    <w:p>
+      <w:pPr>
+        <w:spacing w:line="240" w:lineRule="exact"/>
+      </w:pPr>
+      <w:r>
+        <w:rPr>
+          <w:rFonts w:ascii="Times New Roman" w:cs="Times New Roman" w:eastAsia="Times New Roman" w:hAnsi="Times New Roman"/>
+          <w:sz w:val="24"/>
+          <w:szCs w:val="24"/>
+        </w:rPr>
         <w:t xml:space="preserve">'My pupil is his daughter Clementina. I dearly love her already. She's a delicate thing - dresses always in white; and the sweetest, simplest manners! Only eighteen years old. I'm to give three lessons a week; and, just think, Joe! $5 a lesson. I don't mind it a bit; for when I get two or three more pupils I can resume my lessons with Herr Rosenstock. Now, smooth out that wrinkle between your brows, dear, and let's have a nice supper.'</w:t>
       </w:r>
     </w:p>
@@ -3932,6 +4231,19 @@
           <w:sz w:val="24"/>
           <w:szCs w:val="24"/>
         </w:rPr>
+        <w:t xml:space="preserve">24 O HENRY - 100 SELECTED STORIES</w:t>
+      </w:r>
+    </w:p>
+    <w:p>
+      <w:pPr>
+        <w:spacing w:line="240" w:lineRule="exact"/>
+      </w:pPr>
+      <w:r>
+        <w:rPr>
+          <w:rFonts w:ascii="Times New Roman" w:cs="Times New Roman" w:eastAsia="Times New Roman" w:hAnsi="Times New Roman"/>
+          <w:sz w:val="24"/>
+          <w:szCs w:val="24"/>
+        </w:rPr>
         <w:t xml:space="preserve">'Sometimes,' she said, a little wearily, 'Clementina tries me. I'm afraid she doesn't practise enough, and I have to tell her the same things so often. And then she always dresses entirely in white, and that does get monotonous. But General Pinkney is the dearest old man! I wish you could know him, Joe. He comes in sometimes when I am with Clementina at the piano - he is a widower, you know - and stands there pulling his white goatee. "And how are the semiquavers and the demi-semiquavers progressing?" he always asks.'</w:t>
       </w:r>
     </w:p>
@@ -4148,6 +4460,19 @@
           <w:sz w:val="24"/>
           <w:szCs w:val="24"/>
         </w:rPr>
+        <w:t xml:space="preserve">O HENRY - 100 SELECTED STORIES 25</w:t>
+      </w:r>
+    </w:p>
+    <w:p>
+      <w:pPr>
+        <w:spacing w:line="240" w:lineRule="exact"/>
+      </w:pPr>
+      <w:r>
+        <w:rPr>
+          <w:rFonts w:ascii="Times New Roman" w:cs="Times New Roman" w:eastAsia="Times New Roman" w:hAnsi="Times New Roman"/>
+          <w:sz w:val="24"/>
+          <w:szCs w:val="24"/>
+        </w:rPr>
         <w:t xml:space="preserve">'Clementina,' she explained, 'insisted upon a Welsh rabbit after her lesson. She is such a queer girl. Welsh rabbits at five in the afternoon. The General was there. You should have seen him run for the chafing dish, Joe, just as if there wasn't a servant in the house. I know Clementina isn't in good health; she is so nervous. In serving the rabbit she spilled a great lot of it, boiling hot, over my hand and wrist. It hurt awfully, Joe. And the dear girl was so sorry! But General Pinkney! - Joe, that old man nearly went distracted. He rushed downstairs and sent somebody - they said the furnace man or somebody in the basement - out to a drug store for some oil and things to bind it up with. It doesn't hurt so much now.'</w:t>
       </w:r>
     </w:p>
@@ -4382,6 +4707,19 @@
           <w:sz w:val="24"/>
           <w:szCs w:val="24"/>
         </w:rPr>
+        <w:t xml:space="preserve">26 O HENRY - 100 SELECTED STORIES</w:t>
+      </w:r>
+    </w:p>
+    <w:p>
+      <w:pPr>
+        <w:spacing w:line="240" w:lineRule="exact"/>
+      </w:pPr>
+      <w:r>
+        <w:rPr>
+          <w:rFonts w:ascii="Times New Roman" w:cs="Times New Roman" w:eastAsia="Times New Roman" w:hAnsi="Times New Roman"/>
+          <w:sz w:val="24"/>
+          <w:szCs w:val="24"/>
+        </w:rPr>
         <w:t xml:space="preserve">'My purchaser from Peoria,' said Joe, 'and General Pinkney are both creations of the same art - but you wouldn't call it either painting or music.'</w:t>
       </w:r>
     </w:p>
@@ -4557,6 +4895,19 @@
           <w:sz w:val="24"/>
           <w:szCs w:val="24"/>
         </w:rPr>
+        <w:t xml:space="preserve">O HENRY - 100 SELECTED STORIES 27</w:t>
+      </w:r>
+    </w:p>
+    <w:p>
+      <w:pPr>
+        <w:spacing w:line="240" w:lineRule="exact"/>
+      </w:pPr>
+      <w:r>
+        <w:rPr>
+          <w:rFonts w:ascii="Times New Roman" w:cs="Times New Roman" w:eastAsia="Times New Roman" w:hAnsi="Times New Roman"/>
+          <w:sz w:val="24"/>
+          <w:szCs w:val="24"/>
+        </w:rPr>
         <w:t xml:space="preserve">But what was this? Instead of the customary humble and grateful thanks from the non-escorted one there was to be perceived a high-poised head, a prideful dimpling at the corners of a broad mouth, and almost a sparkle in a dull brown eye.</w:t>
       </w:r>
     </w:p>
@@ -4719,6 +5070,19 @@
           <w:sz w:val="24"/>
           <w:szCs w:val="24"/>
         </w:rPr>
+        <w:t xml:space="preserve">28 O HENRY - 100 SELECTED STORIES</w:t>
+      </w:r>
+    </w:p>
+    <w:p>
+      <w:pPr>
+        <w:spacing w:line="240" w:lineRule="exact"/>
+      </w:pPr>
+      <w:r>
+        <w:rPr>
+          <w:rFonts w:ascii="Times New Roman" w:cs="Times New Roman" w:eastAsia="Times New Roman" w:hAnsi="Times New Roman"/>
+          <w:sz w:val="24"/>
+          <w:szCs w:val="24"/>
+        </w:rPr>
         <w:t xml:space="preserve">Across the floor Maggie sailed like a coquettish yacht convoyed by a stately cruiser. And truly, her companion justified the encomiums of the faithful chum. He stood two inches taller than the average Give and Take athlete; his dark hair curled; his eyes and his teeth flashed whenever he bestowed his frequent smiles. The young men of the Clover Leaf Club pinned not their faith to the graces of person as much as they did to its prowess, its achievements in hand-to-hand conflicts, and its preservation from the legal duress that constantly menaced it. The member of the association who would bind a paper-box maiden to his conquering chariot scorned to employ Beau Brummel airs. They were not considered honourable methods of warfare. The swelling biceps, the coat straining at its buttons over the chest, the air of conscious conviction of the super-eminence of the male in the cosmogony of creation, even a calm display of bow legs as subduing and enchanting agents in the gentle tourneys of Cupid - these were the approved arms and ammunition of the Clover Leaf gallants. They viewed, then, the genuflexions and alluring poses of this visitor with their chins at a new angle.</w:t>
       </w:r>
     </w:p>
@@ -4845,6 +5209,19 @@
           <w:sz w:val="24"/>
           <w:szCs w:val="24"/>
         </w:rPr>
+        <w:t xml:space="preserve">O HENRY - 100 SELECTED STORIES 29</w:t>
+      </w:r>
+    </w:p>
+    <w:p>
+      <w:pPr>
+        <w:spacing w:line="240" w:lineRule="exact"/>
+      </w:pPr>
+      <w:r>
+        <w:rPr>
+          <w:rFonts w:ascii="Times New Roman" w:cs="Times New Roman" w:eastAsia="Times New Roman" w:hAnsi="Times New Roman"/>
+          <w:sz w:val="24"/>
+          <w:szCs w:val="24"/>
+        </w:rPr>
         <w:t xml:space="preserve">Dempsey was the leader of the association. He wore a dress suit, and could chin the bar twice with one hand. He was one of 'Big Mike' O'Sullivan's lieutenants, and was never troubled by trouble. No cop dared to arrest him. Whenever he broke a push-cart man's head or shot a member of the Heinrick B. Sweeney Outing and Literary Association in the kneecap, an officer would drop around and say:</w:t>
       </w:r>
     </w:p>
@@ -5043,6 +5420,19 @@
           <w:sz w:val="24"/>
           <w:szCs w:val="24"/>
         </w:rPr>
+        <w:t xml:space="preserve">30 O HENRY - 100 SELECTED STORIES</w:t>
+      </w:r>
+    </w:p>
+    <w:p>
+      <w:pPr>
+        <w:spacing w:line="240" w:lineRule="exact"/>
+      </w:pPr>
+      <w:r>
+        <w:rPr>
+          <w:rFonts w:ascii="Times New Roman" w:cs="Times New Roman" w:eastAsia="Times New Roman" w:hAnsi="Times New Roman"/>
+          <w:sz w:val="24"/>
+          <w:szCs w:val="24"/>
+        </w:rPr>
         <w:t xml:space="preserve">'Lots of things he never saw,' said the favourite of the hop.</w:t>
       </w:r>
     </w:p>
@@ -5277,6 +5667,19 @@
           <w:sz w:val="24"/>
           <w:szCs w:val="24"/>
         </w:rPr>
+        <w:t xml:space="preserve">O HENRY - 100 SELECTED STORIES 31</w:t>
+      </w:r>
+    </w:p>
+    <w:p>
+      <w:pPr>
+        <w:spacing w:line="240" w:lineRule="exact"/>
+      </w:pPr>
+      <w:r>
+        <w:rPr>
+          <w:rFonts w:ascii="Times New Roman" w:cs="Times New Roman" w:eastAsia="Times New Roman" w:hAnsi="Times New Roman"/>
+          <w:sz w:val="24"/>
+          <w:szCs w:val="24"/>
+        </w:rPr>
         <w:t xml:space="preserve">But Maggie was off, darting her zigzag way through the maze of dancers. She burst through the rear door into the dark hall and then threw her solid shoulder against the door of the room of single combat. It gave way, and in the instant that she entered her eye caught the scene - the Board standing about with open watches; Dempsey Donovan in his shirt-sleeves dancing, light-footed, with the wary grace of the modern pugilist, within easy reach of his adversary; Terry O'Sullivan standing with arm folded and a murderous look in his dark eyes. And without slacking the speed of her entrance she leaped forward with a scream - leaped in time to catch and hang upon the arm of O'Sullivan that was suddenly uplifted, and to whisk from it the long, bright stiletto that he had drawn from his bosom.</w:t>
       </w:r>
     </w:p>
@@ -5439,6 +5842,19 @@
           <w:sz w:val="24"/>
           <w:szCs w:val="24"/>
         </w:rPr>
+        <w:t xml:space="preserve">32 O HENRY - 100 SELECTED STORIES</w:t>
+      </w:r>
+    </w:p>
+    <w:p>
+      <w:pPr>
+        <w:spacing w:line="240" w:lineRule="exact"/>
+      </w:pPr>
+      <w:r>
+        <w:rPr>
+          <w:rFonts w:ascii="Times New Roman" w:cs="Times New Roman" w:eastAsia="Times New Roman" w:hAnsi="Times New Roman"/>
+          <w:sz w:val="24"/>
+          <w:szCs w:val="24"/>
+        </w:rPr>
         <w:t xml:space="preserve">'Say, Mag,' he said, 'I'll see you home. And how about next Saturday night? Will you come to the hop with me if I call around for you?'</w:t>
       </w:r>
     </w:p>
@@ -5614,6 +6030,19 @@
           <w:sz w:val="24"/>
           <w:szCs w:val="24"/>
         </w:rPr>
+        <w:t xml:space="preserve">O HENRY - 100 SELECTED STORIES 33</w:t>
+      </w:r>
+    </w:p>
+    <w:p>
+      <w:pPr>
+        <w:spacing w:line="240" w:lineRule="exact"/>
+      </w:pPr>
+      <w:r>
+        <w:rPr>
+          <w:rFonts w:ascii="Times New Roman" w:cs="Times New Roman" w:eastAsia="Times New Roman" w:hAnsi="Times New Roman"/>
+          <w:sz w:val="24"/>
+          <w:szCs w:val="24"/>
+        </w:rPr>
         <w:t xml:space="preserve">In Soapy's opinion the Law was more benign than Philanthropy. There was an endless round of institutions, municipal and eleemosynary, on which he might set out and receive lodging and food accordant with the simple life. But to one of Soapy's proud spirit the gifts of charity are encumbered. If not in coin you must pay in humiliation of spirit for every benefit received at the hands of philanthropy. As Caesar had his Brutus, every bed of charity must have its toll of a bath, every loaf of bread its compensation of a private and personal inquisition. Wherefore it is better to be a guest of the law, which, though conducted by rules, does not meddle unduly with a gentleman's private affairs.</w:t>
       </w:r>
     </w:p>
@@ -5722,6 +6151,19 @@
           <w:sz w:val="24"/>
           <w:szCs w:val="24"/>
         </w:rPr>
+        <w:t xml:space="preserve">34 O HENRY - 100 SELECTED STORIES</w:t>
+      </w:r>
+    </w:p>
+    <w:p>
+      <w:pPr>
+        <w:spacing w:line="240" w:lineRule="exact"/>
+      </w:pPr>
+      <w:r>
+        <w:rPr>
+          <w:rFonts w:ascii="Times New Roman" w:cs="Times New Roman" w:eastAsia="Times New Roman" w:hAnsi="Times New Roman"/>
+          <w:sz w:val="24"/>
+          <w:szCs w:val="24"/>
+        </w:rPr>
         <w:t xml:space="preserve">At a corner of Sixth Avenue electric lights and cunningly displayed wares behind plate-glass made a shop window conspicuous. Soapy took a cobblestone and dashed it through the glass. People came running round the corner, a policeman in the lead. Soapy stood still, with his hands in his pockets, and smiled at the sight of brass buttons.</w:t>
       </w:r>
     </w:p>
@@ -5884,6 +6326,19 @@
           <w:sz w:val="24"/>
           <w:szCs w:val="24"/>
         </w:rPr>
+        <w:t xml:space="preserve">O HENRY - 100 SELECTED STORIES 35</w:t>
+      </w:r>
+    </w:p>
+    <w:p>
+      <w:pPr>
+        <w:spacing w:line="240" w:lineRule="exact"/>
+      </w:pPr>
+      <w:r>
+        <w:rPr>
+          <w:rFonts w:ascii="Times New Roman" w:cs="Times New Roman" w:eastAsia="Times New Roman" w:hAnsi="Times New Roman"/>
+          <w:sz w:val="24"/>
+          <w:szCs w:val="24"/>
+        </w:rPr>
         <w:t xml:space="preserve">It was Soapy's design to assume the role of the despicable and execrated 'masher.' The refined and elegant appearance of his victim and the contiguity of the conscientious cop encouraged him to believe that he would soon feel the pleasant official clutch upon his arm that would ensure his winter quarters on the right little, tight little isle.</w:t>
       </w:r>
     </w:p>
@@ -6064,6 +6519,19 @@
           <w:sz w:val="24"/>
           <w:szCs w:val="24"/>
         </w:rPr>
+        <w:t xml:space="preserve">36 O HENRY - 100 SELECTED STORIES</w:t>
+      </w:r>
+    </w:p>
+    <w:p>
+      <w:pPr>
+        <w:spacing w:line="240" w:lineRule="exact"/>
+      </w:pPr>
+      <w:r>
+        <w:rPr>
+          <w:rFonts w:ascii="Times New Roman" w:cs="Times New Roman" w:eastAsia="Times New Roman" w:hAnsi="Times New Roman"/>
+          <w:sz w:val="24"/>
+          <w:szCs w:val="24"/>
+        </w:rPr>
         <w:t xml:space="preserve">Disconsolate, Soapy ceased his unavailing racket. Would never a policeman lay hands on him? In his fancy the Island seemed an unattainable Arcadia. He buttoned his thin coat against the chilling wind.</w:t>
       </w:r>
     </w:p>
@@ -6262,6 +6730,19 @@
           <w:sz w:val="24"/>
           <w:szCs w:val="24"/>
         </w:rPr>
+        <w:t xml:space="preserve">O HENRY - 100 SELECTED STORIES 37</w:t>
+      </w:r>
+    </w:p>
+    <w:p>
+      <w:pPr>
+        <w:spacing w:line="240" w:lineRule="exact"/>
+      </w:pPr>
+      <w:r>
+        <w:rPr>
+          <w:rFonts w:ascii="Times New Roman" w:cs="Times New Roman" w:eastAsia="Times New Roman" w:hAnsi="Times New Roman"/>
+          <w:sz w:val="24"/>
+          <w:szCs w:val="24"/>
+        </w:rPr>
         <w:t xml:space="preserve">The moon was above, lustrous and serene; vehicles and pedestrians were few; sparrows twittered sleepily in the eaves - for a little while the scene might have been a country churchyard. And the anthem that the organist played cemented Soapy to the iron fence, for he had known it well in the days when his life contained such things as mothers and roses and ambitions and friends and immaculate thoughts and collars.</w:t>
       </w:r>
     </w:p>
@@ -6455,6 +6936,19 @@
           <w:sz w:val="24"/>
           <w:szCs w:val="24"/>
         </w:rPr>
+        <w:t xml:space="preserve">38 O HENRY - 100 SELECTED STORIES</w:t>
+      </w:r>
+    </w:p>
+    <w:p>
+      <w:pPr>
+        <w:spacing w:line="240" w:lineRule="exact"/>
+      </w:pPr>
+      <w:r>
+        <w:rPr>
+          <w:rFonts w:ascii="Times New Roman" w:cs="Times New Roman" w:eastAsia="Times New Roman" w:hAnsi="Times New Roman"/>
+          <w:sz w:val="24"/>
+          <w:szCs w:val="24"/>
+        </w:rPr>
         <w:t xml:space="preserve">But you needn't look for any stuck-up literature in my piece, such as Bearoo, the bear, and Snakoo, the snake, and Tammanoo, the tiger, talk in the jungle books. A yellow dog that's spent most of his life in a cheap New York flat, sleeping in a corner on an old sateen underskirt (the one she spilled port wine on at the Lady Longshoremen's banquet), mustn't be expected to perform any tricks with the art of speech.</w:t>
       </w:r>
     </w:p>
@@ -6545,6 +7039,19 @@
           <w:sz w:val="24"/>
           <w:szCs w:val="24"/>
         </w:rPr>
+        <w:t xml:space="preserve">O HENRY - 100 SELECTED STORIES 39</w:t>
+      </w:r>
+    </w:p>
+    <w:p>
+      <w:pPr>
+        <w:spacing w:line="240" w:lineRule="exact"/>
+      </w:pPr>
+      <w:r>
+        <w:rPr>
+          <w:rFonts w:ascii="Times New Roman" w:cs="Times New Roman" w:eastAsia="Times New Roman" w:hAnsi="Times New Roman"/>
+          <w:sz w:val="24"/>
+          <w:szCs w:val="24"/>
+        </w:rPr>
         <w:t xml:space="preserve">If men knew how women pass the time when they are alone they'd never marry. Laura Lean Jibbey, peanut brittle, a little almond cream on the neck muscles, dishes unwashed, half an hour's talk with the iceman, reading a package of old letters, a couple of pickles and two bottles of malt extract, one hour peeking through a hole in the window shade into the flat across the air-shaft - that's about all there is to it. Twenty minutes before time for him to come home from work she straightens up the house, fixes her rat so it won't show, and gets out a lot of sewing for a ten-minute bluff.</w:t>
       </w:r>
     </w:p>
@@ -6707,6 +7214,19 @@
           <w:sz w:val="24"/>
           <w:szCs w:val="24"/>
         </w:rPr>
+        <w:t xml:space="preserve">40 O HENRY - 100 SELECTED STORIES</w:t>
+      </w:r>
+    </w:p>
+    <w:p>
+      <w:pPr>
+        <w:spacing w:line="240" w:lineRule="exact"/>
+      </w:pPr>
+      <w:r>
+        <w:rPr>
+          <w:rFonts w:ascii="Times New Roman" w:cs="Times New Roman" w:eastAsia="Times New Roman" w:hAnsi="Times New Roman"/>
+          <w:sz w:val="24"/>
+          <w:szCs w:val="24"/>
+        </w:rPr>
         <w:t xml:space="preserve">In the flat across the hall from us lived a lady with a black-and-tan terrier. Her husband strung it and took it out every evening, but he always came home cheerful and whistling. One day I touched noses with the black-and-tan in the hall, and I struck him for an elucidation.</w:t>
       </w:r>
     </w:p>
@@ -6869,6 +7389,19 @@
           <w:sz w:val="24"/>
           <w:szCs w:val="24"/>
         </w:rPr>
+        <w:t xml:space="preserve">O HENRY - 100 SELECTED STORIES 41</w:t>
+      </w:r>
+    </w:p>
+    <w:p>
+      <w:pPr>
+        <w:spacing w:line="240" w:lineRule="exact"/>
+      </w:pPr>
+      <w:r>
+        <w:rPr>
+          <w:rFonts w:ascii="Times New Roman" w:cs="Times New Roman" w:eastAsia="Times New Roman" w:hAnsi="Times New Roman"/>
+          <w:sz w:val="24"/>
+          <w:szCs w:val="24"/>
+        </w:rPr>
         <w:t xml:space="preserve">'Poor doggie,' says he; 'good doggie. She shan't kiss you any more. 'S a darned shame. Good doggie, go away and get run over by a street car and be happy.'</w:t>
       </w:r>
     </w:p>
@@ -7116,6 +7649,19 @@
           <w:sz w:val="24"/>
           <w:szCs w:val="24"/>
         </w:rPr>
+        <w:t xml:space="preserve">42 O HENRY - 100 SELECTED STORIES</w:t>
+      </w:r>
+    </w:p>
+    <w:p>
+      <w:pPr>
+        <w:spacing w:line="240" w:lineRule="exact"/>
+      </w:pPr>
+      <w:r>
+        <w:rPr>
+          <w:rFonts w:ascii="Times New Roman" w:cs="Times New Roman" w:eastAsia="Times New Roman" w:hAnsi="Times New Roman"/>
+          <w:sz w:val="24"/>
+          <w:szCs w:val="24"/>
+        </w:rPr>
         <w:t xml:space="preserve">THE BLUE LIGHT DRUG STORE is down-town, between the Bowery and First Avenue, where the distance between the two streets is the shortest. The Blue Light does not consider that pharmacy is a thing of bric-a-brac, scent and ice-cream soda. If you ask it for a pain-killer it will not give you a bonbon.</w:t>
       </w:r>
     </w:p>
@@ -7224,6 +7770,19 @@
           <w:sz w:val="24"/>
           <w:szCs w:val="24"/>
         </w:rPr>
+        <w:t xml:space="preserve">O HENRY - 100 SELECTED STORIES 43</w:t>
+      </w:r>
+    </w:p>
+    <w:p>
+      <w:pPr>
+        <w:spacing w:line="240" w:lineRule="exact"/>
+      </w:pPr>
+      <w:r>
+        <w:rPr>
+          <w:rFonts w:ascii="Times New Roman" w:cs="Times New Roman" w:eastAsia="Times New Roman" w:hAnsi="Times New Roman"/>
+          <w:sz w:val="24"/>
+          <w:szCs w:val="24"/>
+        </w:rPr>
         <w:t xml:space="preserve">One afternoon McGowan drifted in in his silent, easy way, and sat, comely, smoothed-faced, hard, indomitable, good-natured, upon a stool.</w:t>
       </w:r>
     </w:p>
@@ -7440,6 +7999,19 @@
           <w:sz w:val="24"/>
           <w:szCs w:val="24"/>
         </w:rPr>
+        <w:t xml:space="preserve">44 O HENRY - 100 SELECTED STORIES</w:t>
+      </w:r>
+    </w:p>
+    <w:p>
+      <w:pPr>
+        <w:spacing w:line="240" w:lineRule="exact"/>
+      </w:pPr>
+      <w:r>
+        <w:rPr>
+          <w:rFonts w:ascii="Times New Roman" w:cs="Times New Roman" w:eastAsia="Times New Roman" w:hAnsi="Times New Roman"/>
+          <w:sz w:val="24"/>
+          <w:szCs w:val="24"/>
+        </w:rPr>
         <w:t xml:space="preserve">'You will excuse me, Chunk,' said Ikey. 'I must make a prescription that is to be called for soon.'</w:t>
       </w:r>
     </w:p>
@@ -7620,6 +8192,19 @@
           <w:sz w:val="24"/>
           <w:szCs w:val="24"/>
         </w:rPr>
+        <w:t xml:space="preserve">O HENRY - 100 SELECTED STORIES 45</w:t>
+      </w:r>
+    </w:p>
+    <w:p>
+      <w:pPr>
+        <w:spacing w:line="240" w:lineRule="exact"/>
+      </w:pPr>
+      <w:r>
+        <w:rPr>
+          <w:rFonts w:ascii="Times New Roman" w:cs="Times New Roman" w:eastAsia="Times New Roman" w:hAnsi="Times New Roman"/>
+          <w:sz w:val="24"/>
+          <w:szCs w:val="24"/>
+        </w:rPr>
         <w:t xml:space="preserve">Ikey went behind the prescription desk. There he crushed to a powder two soluble tablets, each containing a quarter of a grain of morphia. To them he added a little sugar of milk to increase the bulk, and folded the mixture neatly in a white paper. Taken by an adult this powder would ensure several hours of heavy slumber without danger to the sleeper. This he handed to Chunk McGowan, telling him to administer it in a liquid, if possible, and received the hearty thanks of the backyard Lochinvar.</w:t>
       </w:r>
     </w:p>
@@ -7813,6 +8398,141 @@
           <w:sz w:val="24"/>
           <w:szCs w:val="24"/>
         </w:rPr>
+        <w:t xml:space="preserve">74 O HENRY - 100 SELECTED STORIES</w:t>
+      </w:r>
+    </w:p>
+    <w:p>
+      <w:pPr>
+        <w:spacing w:line="240" w:lineRule="exact"/>
+      </w:pPr>
+      <w:r>
+        <w:rPr>
+          <w:rFonts w:ascii="Times New Roman" w:cs="Times New Roman" w:eastAsia="Times New Roman" w:hAnsi="Times New Roman"/>
+          <w:sz w:val="24"/>
+          <w:szCs w:val="24"/>
+        </w:rPr>
+        <w:t xml:space="preserve">moment immovable. For this odour belonged to Miss Leslie; it was her own, and hers only. The odour brought her vividly, almost tangibly before him. The world of finance dwindled suddenly to a speck. And she was in the next room - twenty steps away.</w:t>
+      </w:r>
+    </w:p>
+    <w:p>
+      <w:pPr>
+        <w:spacing w:line="240" w:lineRule="exact"/>
+      </w:pPr>
+      <w:r>
+        <w:rPr>
+          <w:rFonts w:ascii="Times New Roman" w:cs="Times New Roman" w:eastAsia="Times New Roman" w:hAnsi="Times New Roman"/>
+          <w:sz w:val="24"/>
+          <w:szCs w:val="24"/>
+        </w:rPr>
+        <w:t xml:space="preserve">'By George, I'll do it now,' said Maxwell, half aloud. 'I'll ask her now. I wonder I didn't do it long ago.'</w:t>
+      </w:r>
+    </w:p>
+    <w:p>
+      <w:pPr>
+        <w:spacing w:line="240" w:lineRule="exact"/>
+      </w:pPr>
+      <w:r>
+        <w:rPr>
+          <w:rFonts w:ascii="Times New Roman" w:cs="Times New Roman" w:eastAsia="Times New Roman" w:hAnsi="Times New Roman"/>
+          <w:sz w:val="24"/>
+          <w:szCs w:val="24"/>
+        </w:rPr>
+        <w:t xml:space="preserve">He dashed into the inner office with the haste of a short trying to cover. He charged upon the desk of the stenographer.</w:t>
+      </w:r>
+    </w:p>
+    <w:p>
+      <w:pPr>
+        <w:spacing w:line="240" w:lineRule="exact"/>
+      </w:pPr>
+      <w:r>
+        <w:rPr>
+          <w:rFonts w:ascii="Times New Roman" w:cs="Times New Roman" w:eastAsia="Times New Roman" w:hAnsi="Times New Roman"/>
+          <w:sz w:val="24"/>
+          <w:szCs w:val="24"/>
+        </w:rPr>
+        <w:t xml:space="preserve">She looked up at him with a smile. A soft pink crept over her cheek, and her eyes were kind and frank. Maxwell leaned one elbow on her desk. He still clutched fluttering papers with both hands and the pen was above his ear.</w:t>
+      </w:r>
+    </w:p>
+    <w:p>
+      <w:pPr>
+        <w:spacing w:line="240" w:lineRule="exact"/>
+      </w:pPr>
+      <w:r>
+        <w:rPr>
+          <w:rFonts w:ascii="Times New Roman" w:cs="Times New Roman" w:eastAsia="Times New Roman" w:hAnsi="Times New Roman"/>
+          <w:sz w:val="24"/>
+          <w:szCs w:val="24"/>
+        </w:rPr>
+        <w:t xml:space="preserve">'Miss Leslie,' he began hurriedly, 'I have but a moment to spare. I want to say something in that moment. Will you be my wife? I haven't had time to make love to you in the ordinary way, but I really do love you. Talk quick, please - those fellows are clubbing the stuffing out of Union Pacific'</w:t>
+      </w:r>
+    </w:p>
+    <w:p>
+      <w:pPr>
+        <w:spacing w:line="240" w:lineRule="exact"/>
+      </w:pPr>
+      <w:r>
+        <w:rPr>
+          <w:rFonts w:ascii="Times New Roman" w:cs="Times New Roman" w:eastAsia="Times New Roman" w:hAnsi="Times New Roman"/>
+          <w:sz w:val="24"/>
+          <w:szCs w:val="24"/>
+        </w:rPr>
+        <w:t xml:space="preserve">'Oh, what are you talking about?' exclaimed the young lady. She rose to her feet and gazed upon him, round-eyed.</w:t>
+      </w:r>
+    </w:p>
+    <w:p>
+      <w:pPr>
+        <w:spacing w:line="240" w:lineRule="exact"/>
+      </w:pPr>
+      <w:r>
+        <w:rPr>
+          <w:rFonts w:ascii="Times New Roman" w:cs="Times New Roman" w:eastAsia="Times New Roman" w:hAnsi="Times New Roman"/>
+          <w:sz w:val="24"/>
+          <w:szCs w:val="24"/>
+        </w:rPr>
+        <w:t xml:space="preserve">'Don't you understand?' said Maxwell restively. 'I want you to marry me. I love you, Miss Leslie. I wanted to tell you, and I snatched a minute when things had slackened up a bit. They're calling me for the 'phone now. Tell 'em to wait a minute, Pitcher. Won't you, Miss Leslie?'</w:t>
+      </w:r>
+    </w:p>
+    <w:p>
+      <w:pPr>
+        <w:spacing w:line="240" w:lineRule="exact"/>
+      </w:pPr>
+      <w:r>
+        <w:rPr>
+          <w:rFonts w:ascii="Times New Roman" w:cs="Times New Roman" w:eastAsia="Times New Roman" w:hAnsi="Times New Roman"/>
+          <w:sz w:val="24"/>
+          <w:szCs w:val="24"/>
+        </w:rPr>
+        <w:t xml:space="preserve">The stenographer acted very queerly. At first she seemed overcome with amazement; then tears flowed from her wondering eyes; and then she smiled sunnily through them, and one of her arms slid tenderly about the broker's neck.</w:t>
+      </w:r>
+    </w:p>
+    <w:p>
+      <w:pPr>
+        <w:spacing w:line="240" w:lineRule="exact"/>
+      </w:pPr>
+      <w:r>
+        <w:rPr>
+          <w:rFonts w:ascii="Times New Roman" w:cs="Times New Roman" w:eastAsia="Times New Roman" w:hAnsi="Times New Roman"/>
+          <w:sz w:val="24"/>
+          <w:szCs w:val="24"/>
+        </w:rPr>
+        <w:t xml:space="preserve">'I know now,' she said softly. 'It's this old business that has driven everything else out of your head for the time. I was frightened at first. Don't you remember, Harvey? We were married last evening at eight o'clock in the Little Church Around the Corner.'</w:t>
+      </w:r>
+    </w:p>
+    <w:p>
+      <w:pPr>
+        <w:spacing w:line="240" w:lineRule="exact"/>
+      </w:pPr>
+    </w:p>
+    <w:p>
+      <w:pPr>
+        <w:spacing w:line="240" w:lineRule="exact"/>
+      </w:pPr>
+      <w:r>
+        <w:rPr>
+          <w:rFonts w:ascii="Times New Roman" w:cs="Times New Roman" w:eastAsia="Times New Roman" w:hAnsi="Times New Roman"/>
+          <w:sz w:val="24"/>
+          <w:szCs w:val="24"/>
+        </w:rPr>
         <w:t xml:space="preserve">RESTLESS, SHIFTING, FUGACIOUS as time itself, is a certain vast bulk of the population of the red-brick district of the lower West Side.</w:t>
       </w:r>
     </w:p>
@@ -7831,6 +8551,19 @@
           <w:sz w:val="24"/>
           <w:szCs w:val="24"/>
         </w:rPr>
+        <w:t xml:space="preserve">O HENRY - 100 SELECTED STORIES 75</w:t>
+      </w:r>
+    </w:p>
+    <w:p>
+      <w:pPr>
+        <w:spacing w:line="240" w:lineRule="exact"/>
+      </w:pPr>
+      <w:r>
+        <w:rPr>
+          <w:rFonts w:ascii="Times New Roman" w:cs="Times New Roman" w:eastAsia="Times New Roman" w:hAnsi="Times New Roman"/>
+          <w:sz w:val="24"/>
+          <w:szCs w:val="24"/>
+        </w:rPr>
         <w:t xml:space="preserve">Homeless, they have a hundred homes. They flit from furnished room to furnished room, transients for ever - transients in abode, transients in heart and mind. They sing 'Home Sweet Home' in ragtime; they carry their lares et penates in a bandbox; their vine is entwined about a picture hat; a rubber plant is their fig tree.</w:t>
       </w:r>
     </w:p>
@@ -7957,6 +8690,19 @@
           <w:sz w:val="24"/>
           <w:szCs w:val="24"/>
         </w:rPr>
+        <w:t xml:space="preserve">76 O HENRY - 100 SELECTED STORIES</w:t>
+      </w:r>
+    </w:p>
+    <w:p>
+      <w:pPr>
+        <w:spacing w:line="240" w:lineRule="exact"/>
+      </w:pPr>
+      <w:r>
+        <w:rPr>
+          <w:rFonts w:ascii="Times New Roman" w:cs="Times New Roman" w:eastAsia="Times New Roman" w:hAnsi="Times New Roman"/>
+          <w:sz w:val="24"/>
+          <w:szCs w:val="24"/>
+        </w:rPr>
         <w:t xml:space="preserve">'This is the room,' said the housekeeper, from her furry throat. 'It's a nice room. It ain't often vacant. I had some most elegant people in it last summer - no trouble at all, and paid in advance to the minute. The water's at the end of the hall. Sprowls and Mooney kept it three months. They done a vaudeville sketch. Miss B'retta Sprowls - you may have heard of her - Oh, that was just the stage names - right there over the dresser is where the marriage certificate hung, framed. The gas is here, and you see there is plenty of closet room. It's a room everybody likes. It never stays idle long.'</w:t>
       </w:r>
     </w:p>
@@ -8119,6 +8865,19 @@
           <w:sz w:val="24"/>
           <w:szCs w:val="24"/>
         </w:rPr>
+        <w:t xml:space="preserve">O HENRY - 100 SELECTED STORIES 77</w:t>
+      </w:r>
+    </w:p>
+    <w:p>
+      <w:pPr>
+        <w:spacing w:line="240" w:lineRule="exact"/>
+      </w:pPr>
+      <w:r>
+        <w:rPr>
+          <w:rFonts w:ascii="Times New Roman" w:cs="Times New Roman" w:eastAsia="Times New Roman" w:hAnsi="Times New Roman"/>
+          <w:sz w:val="24"/>
+          <w:szCs w:val="24"/>
+        </w:rPr>
         <w:t xml:space="preserve">A polychromatic rug like some brilliant-flowered, rectangular, tropical islet lay surrounded by a billowy sea of soiled matting. Upon the gay-papered wall were those pictures that pursue the homeless one from house to house - The Huguenot Lovers, The First Quarrel, The Wedding Breakfast, Psyche at the Fountain. The mantel's chastely severe outline was ingloriously veiled behind some pert drapery drawn rakishly askew like the sashes of the Amazonian ballet. Upon it was some desolate flotsam cast aside by the room's marooned when a lucky sail had borne them to a fresh port - a trifling vase or two, pictures of actresses, a medicine bottle, some stray cards out of a deck.</w:t>
       </w:r>
     </w:p>
@@ -8155,6 +8914,19 @@
           <w:sz w:val="24"/>
           <w:szCs w:val="24"/>
         </w:rPr>
+        <w:t xml:space="preserve">78 O HENRY - 100 SELECTED STORIES</w:t>
+      </w:r>
+    </w:p>
+    <w:p>
+      <w:pPr>
+        <w:spacing w:line="240" w:lineRule="exact"/>
+      </w:pPr>
+      <w:r>
+        <w:rPr>
+          <w:rFonts w:ascii="Times New Roman" w:cs="Times New Roman" w:eastAsia="Times New Roman" w:hAnsi="Times New Roman"/>
+          <w:sz w:val="24"/>
+          <w:szCs w:val="24"/>
+        </w:rPr>
         <w:t xml:space="preserve">The young tenant in the chair allowed these thoughts to file, soft-shod, through his mind, while there drifted into the room furnished sounds and furnished scents. He heard in one room a tittering and incontinent, slack laughter; in others the monologue of a scold, the rattling of dice, a lullaby, and one crying dully; above him a banjo tinkled with spirit. Doors banged somewhere; the elevated trains roared intermittently; a cat yowled miserably upon a back fence. And he breathed the breath of the house - a dank savour rather than a smell - a cold, musty effluvium as from underground vaults mingled with the reeking exhalations of linoleum and mildewed and rotten woodwork.</w:t>
       </w:r>
     </w:p>
@@ -8245,6 +9017,19 @@
           <w:sz w:val="24"/>
           <w:szCs w:val="24"/>
         </w:rPr>
+        <w:t xml:space="preserve">O HENRY - 100 SELECTED STORIES 79</w:t>
+      </w:r>
+    </w:p>
+    <w:p>
+      <w:pPr>
+        <w:spacing w:line="240" w:lineRule="exact"/>
+      </w:pPr>
+      <w:r>
+        <w:rPr>
+          <w:rFonts w:ascii="Times New Roman" w:cs="Times New Roman" w:eastAsia="Times New Roman" w:hAnsi="Times New Roman"/>
+          <w:sz w:val="24"/>
+          <w:szCs w:val="24"/>
+        </w:rPr>
         <w:t xml:space="preserve">He burrowed in crevices and corners, and found corks and cigarettes. These he passed in passive contempt. But once he found in a fold of the matting a half-smoked cigar, and this he ground beneath his heel with a green and trenchant oath. He sifted the room from end to end. He found dreary and ignoble small records of many a peripatetic tenant; but of her whom he sought, and who may have lodged there, and whose spirit seemed to hover there, he found no trace.</w:t>
       </w:r>
     </w:p>
@@ -8443,6 +9228,32 @@
           <w:sz w:val="24"/>
           <w:szCs w:val="24"/>
         </w:rPr>
+        <w:t xml:space="preserve">• ••• •</w:t>
+      </w:r>
+    </w:p>
+    <w:p>
+      <w:pPr>
+        <w:spacing w:line="240" w:lineRule="exact"/>
+      </w:pPr>
+      <w:r>
+        <w:rPr>
+          <w:rFonts w:ascii="Times New Roman" w:cs="Times New Roman" w:eastAsia="Times New Roman" w:hAnsi="Times New Roman"/>
+          <w:sz w:val="24"/>
+          <w:szCs w:val="24"/>
+        </w:rPr>
+        <w:t xml:space="preserve">80 O HENRY - 100 SELECTED STORIES</w:t>
+      </w:r>
+    </w:p>
+    <w:p>
+      <w:pPr>
+        <w:spacing w:line="240" w:lineRule="exact"/>
+      </w:pPr>
+      <w:r>
+        <w:rPr>
+          <w:rFonts w:ascii="Times New Roman" w:cs="Times New Roman" w:eastAsia="Times New Roman" w:hAnsi="Times New Roman"/>
+          <w:sz w:val="24"/>
+          <w:szCs w:val="24"/>
+        </w:rPr>
         <w:t xml:space="preserve">It was Mrs. McCool's night to go with the can for beer. So she fetched it and sat with Mrs. Purdy in one of those subterranean retreats where housekeepers foregather and the worm dieth seldom.</w:t>
       </w:r>
     </w:p>
@@ -8649,6 +9460,19 @@
           <w:sz w:val="24"/>
           <w:szCs w:val="24"/>
         </w:rPr>
+        <w:t xml:space="preserve">178 O HENRY - 100 SELECTED STORIES</w:t>
+      </w:r>
+    </w:p>
+    <w:p>
+      <w:pPr>
+        <w:spacing w:line="240" w:lineRule="exact"/>
+      </w:pPr>
+      <w:r>
+        <w:rPr>
+          <w:rFonts w:ascii="Times New Roman" w:cs="Times New Roman" w:eastAsia="Times New Roman" w:hAnsi="Times New Roman"/>
+          <w:sz w:val="24"/>
+          <w:szCs w:val="24"/>
+        </w:rPr>
         <w:t xml:space="preserve">'A very sad one,' says he, laying the points of his manicured fingers together. 'An utterly incorrigible girl. I am Special Terrestrial Officer the Reverend Jones. The case was assigned to me. The girl murdered her fiancé and committed suicide. She had no defence. My report to the court relates the facts in detail, all of which are substantiated by reliable witnesses. The wages of sin is death. Praise the Lord.'</w:t>
       </w:r>
     </w:p>
@@ -8786,6 +9610,19 @@
           <w:sz w:val="24"/>
           <w:szCs w:val="24"/>
         </w:rPr>
+        <w:t xml:space="preserve">O HENRY - 100 SELECTED STORIES 179</w:t>
+      </w:r>
+    </w:p>
+    <w:p>
+      <w:pPr>
+        <w:spacing w:line="240" w:lineRule="exact"/>
+      </w:pPr>
+      <w:r>
+        <w:rPr>
+          <w:rFonts w:ascii="Times New Roman" w:cs="Times New Roman" w:eastAsia="Times New Roman" w:hAnsi="Times New Roman"/>
+          <w:sz w:val="24"/>
+          <w:szCs w:val="24"/>
+        </w:rPr>
         <w:t xml:space="preserve">At the top of a squatty, three-story brick Sue and Johnsy had their studio. 'Johnsy' was familiar for Joanna. One was from Maine, the other from California. They had met at the table d'hôte of an Eighth Street 'Delmonico's,' and found their tastes in art, chicory salad and bishop sleeves so congenial that the joint studio resulted.</w:t>
       </w:r>
     </w:p>
@@ -8984,6 +9821,19 @@
           <w:sz w:val="24"/>
           <w:szCs w:val="24"/>
         </w:rPr>
+        <w:t xml:space="preserve">180 O HENRY - 100 SELECTED STORIES</w:t>
+      </w:r>
+    </w:p>
+    <w:p>
+      <w:pPr>
+        <w:spacing w:line="240" w:lineRule="exact"/>
+      </w:pPr>
+      <w:r>
+        <w:rPr>
+          <w:rFonts w:ascii="Times New Roman" w:cs="Times New Roman" w:eastAsia="Times New Roman" w:hAnsi="Times New Roman"/>
+          <w:sz w:val="24"/>
+          <w:szCs w:val="24"/>
+        </w:rPr>
         <w:t xml:space="preserve">She arranged her board and began a pen-and-ink drawing to illustrate a magazine story. Young artists must pave their way to Art by drawing pictures for magazine stories that young authors write to pave their way to Literature.</w:t>
       </w:r>
     </w:p>
@@ -9182,6 +10032,19 @@
           <w:sz w:val="24"/>
           <w:szCs w:val="24"/>
         </w:rPr>
+        <w:t xml:space="preserve">O HENRY - 100 SELECTED STORIES 181</w:t>
+      </w:r>
+    </w:p>
+    <w:p>
+      <w:pPr>
+        <w:spacing w:line="240" w:lineRule="exact"/>
+      </w:pPr>
+      <w:r>
+        <w:rPr>
+          <w:rFonts w:ascii="Times New Roman" w:cs="Times New Roman" w:eastAsia="Times New Roman" w:hAnsi="Times New Roman"/>
+          <w:sz w:val="24"/>
+          <w:szCs w:val="24"/>
+        </w:rPr>
         <w:t xml:space="preserve">'Johnsy, dear,' said Sue, bending over her, 'will you promise me to keep your eyes closed, and not look out of the window until I am done working? I must hand those drawings in by to-morrow. I need the light or I would draw the shade down.'</w:t>
       </w:r>
     </w:p>
@@ -9344,6 +10207,19 @@
           <w:sz w:val="24"/>
           <w:szCs w:val="24"/>
         </w:rPr>
+        <w:t xml:space="preserve">182 O HENRY - 100 SELECTED STORIES</w:t>
+      </w:r>
+    </w:p>
+    <w:p>
+      <w:pPr>
+        <w:spacing w:line="240" w:lineRule="exact"/>
+      </w:pPr>
+      <w:r>
+        <w:rPr>
+          <w:rFonts w:ascii="Times New Roman" w:cs="Times New Roman" w:eastAsia="Times New Roman" w:hAnsi="Times New Roman"/>
+          <w:sz w:val="24"/>
+          <w:szCs w:val="24"/>
+        </w:rPr>
         <w:t xml:space="preserve">'She is very ill and weak,' said Sue, 'and the fever has left her mind morbid and full of strange fancies. Very well, Mr. Behrman, if you do not care to pose for me, you needn't. But I think you are a horrid old - old flibberti-gibbet.'</w:t>
       </w:r>
     </w:p>
@@ -9542,6 +10418,19 @@
           <w:sz w:val="24"/>
           <w:szCs w:val="24"/>
         </w:rPr>
+        <w:t xml:space="preserve">O HENRY - 100 SELECTED STORIES 183</w:t>
+      </w:r>
+    </w:p>
+    <w:p>
+      <w:pPr>
+        <w:spacing w:line="240" w:lineRule="exact"/>
+      </w:pPr>
+      <w:r>
+        <w:rPr>
+          <w:rFonts w:ascii="Times New Roman" w:cs="Times New Roman" w:eastAsia="Times New Roman" w:hAnsi="Times New Roman"/>
+          <w:sz w:val="24"/>
+          <w:szCs w:val="24"/>
+        </w:rPr>
         <w:t xml:space="preserve">When it was light enough Johnsy, the merciless, commanded that the shade be raised.</w:t>
       </w:r>
     </w:p>
@@ -9771,6 +10660,76 @@
           <w:sz w:val="24"/>
           <w:szCs w:val="24"/>
         </w:rPr>
+        <w:t xml:space="preserve">286 O HENRY - 100 SELECTED STORIES</w:t>
+      </w:r>
+    </w:p>
+    <w:p>
+      <w:pPr>
+        <w:spacing w:line="240" w:lineRule="exact"/>
+      </w:pPr>
+      <w:r>
+        <w:rPr>
+          <w:rFonts w:ascii="Times New Roman" w:cs="Times New Roman" w:eastAsia="Times New Roman" w:hAnsi="Times New Roman"/>
+          <w:sz w:val="24"/>
+          <w:szCs w:val="24"/>
+        </w:rPr>
+        <w:t xml:space="preserve">Presently Thomas moved tentatively in his seat, and thoughtfully felt an abrasion or two on his knees and elbows.</w:t>
+      </w:r>
+    </w:p>
+    <w:p>
+      <w:pPr>
+        <w:spacing w:line="240" w:lineRule="exact"/>
+      </w:pPr>
+      <w:r>
+        <w:rPr>
+          <w:rFonts w:ascii="Times New Roman" w:cs="Times New Roman" w:eastAsia="Times New Roman" w:hAnsi="Times New Roman"/>
+          <w:sz w:val="24"/>
+          <w:szCs w:val="24"/>
+        </w:rPr>
+        <w:t xml:space="preserve">'Say, Annie,' said he confidentially, 'maybe it's one of the last dreams of the booze, but I've a kind of a recollection of riding in an automobile with a swell guy that took me to a house full of eagles and arc lights. He fed me on biscuits and hot air, and then kicked me down the front steps. If it was the d t's, why am I so sore?'</w:t>
+      </w:r>
+    </w:p>
+    <w:p>
+      <w:pPr>
+        <w:spacing w:line="240" w:lineRule="exact"/>
+      </w:pPr>
+      <w:r>
+        <w:rPr>
+          <w:rFonts w:ascii="Times New Roman" w:cs="Times New Roman" w:eastAsia="Times New Roman" w:hAnsi="Times New Roman"/>
+          <w:sz w:val="24"/>
+          <w:szCs w:val="24"/>
+        </w:rPr>
+        <w:t xml:space="preserve">'Shut up, you fool,' said Annie.</w:t>
+      </w:r>
+    </w:p>
+    <w:p>
+      <w:pPr>
+        <w:spacing w:line="240" w:lineRule="exact"/>
+      </w:pPr>
+      <w:r>
+        <w:rPr>
+          <w:rFonts w:ascii="Times New Roman" w:cs="Times New Roman" w:eastAsia="Times New Roman" w:hAnsi="Times New Roman"/>
+          <w:sz w:val="24"/>
+          <w:szCs w:val="24"/>
+        </w:rPr>
+        <w:t xml:space="preserve">'If I could find that funny guy's house,' said Thomas, in conclusion, 'I'd go up there some day and punch his nose for him.'</w:t>
+      </w:r>
+    </w:p>
+    <w:p>
+      <w:pPr>
+        <w:spacing w:line="240" w:lineRule="exact"/>
+      </w:pPr>
+    </w:p>
+    <w:p>
+      <w:pPr>
+        <w:spacing w:line="240" w:lineRule="exact"/>
+      </w:pPr>
+      <w:r>
+        <w:rPr>
+          <w:rFonts w:ascii="Times New Roman" w:cs="Times New Roman" w:eastAsia="Times New Roman" w:hAnsi="Times New Roman"/>
+          <w:sz w:val="24"/>
+          <w:szCs w:val="24"/>
+        </w:rPr>
         <w:t xml:space="preserve">THE OTHER DAY a poet friend of mine, who has lived in close communication with nature all his life, wrote a poem and took it to an editor.</w:t>
       </w:r>
     </w:p>
@@ -9933,6 +10892,19 @@
           <w:sz w:val="24"/>
           <w:szCs w:val="24"/>
         </w:rPr>
+        <w:t xml:space="preserve">O HENRY - 100 SELECTED STORIES 287</w:t>
+      </w:r>
+    </w:p>
+    <w:p>
+      <w:pPr>
+        <w:spacing w:line="240" w:lineRule="exact"/>
+      </w:pPr>
+      <w:r>
+        <w:rPr>
+          <w:rFonts w:ascii="Times New Roman" w:cs="Times New Roman" w:eastAsia="Times New Roman" w:hAnsi="Times New Roman"/>
+          <w:sz w:val="24"/>
+          <w:szCs w:val="24"/>
+        </w:rPr>
         <w:t xml:space="preserve">The invader was a young man with light blue eyes, a hanging lip, and hair the exact colour of the little orphan's (afterward discovered to be the earl's daughter) in one of Mr. Blaney's plays. His trousers were corduroy, his coat short-sleeved, with buttons in the middle of his back. One bootleg was outside the corduroys. You looked expectantly, though in vain, at his straw hat for ear-holes, its shape inaugurating the suspicion that it had been ravaged from a former equine possessor. In his hand was a valise - description of it is an impossible task; a Boston man would not have carried his lunch and law books to his office in it. And above one ear, in his hair, was a wisp of hay - the rustic's letter of credit, his badge of innocence, the last clinging touch of the Garden of Eden lingering to shame the goldbrick men.</w:t>
       </w:r>
     </w:p>
@@ -10077,6 +11049,19 @@
           <w:sz w:val="24"/>
           <w:szCs w:val="24"/>
         </w:rPr>
+        <w:t xml:space="preserve">288 O HENRY - 100 SELECTED STORIES</w:t>
+      </w:r>
+    </w:p>
+    <w:p>
+      <w:pPr>
+        <w:spacing w:line="240" w:lineRule="exact"/>
+      </w:pPr>
+      <w:r>
+        <w:rPr>
+          <w:rFonts w:ascii="Times New Roman" w:cs="Times New Roman" w:eastAsia="Times New Roman" w:hAnsi="Times New Roman"/>
+          <w:sz w:val="24"/>
+          <w:szCs w:val="24"/>
+        </w:rPr>
         <w:t xml:space="preserve">'I'm glad I come across you, mister,' said Haylocks. 'How'd you like to play a game or two of seven-up? I've got the keerds.'</w:t>
       </w:r>
     </w:p>
@@ -10329,6 +11314,19 @@
           <w:sz w:val="24"/>
           <w:szCs w:val="24"/>
         </w:rPr>
+        <w:t xml:space="preserve">O HENRY - 100 SELECTED STORIES 289</w:t>
+      </w:r>
+    </w:p>
+    <w:p>
+      <w:pPr>
+        <w:spacing w:line="240" w:lineRule="exact"/>
+      </w:pPr>
+      <w:r>
+        <w:rPr>
+          <w:rFonts w:ascii="Times New Roman" w:cs="Times New Roman" w:eastAsia="Times New Roman" w:hAnsi="Times New Roman"/>
+          <w:sz w:val="24"/>
+          <w:szCs w:val="24"/>
+        </w:rPr>
         <w:t xml:space="preserve">'Divvy? Mike,' said the men hanging upon the bar, winking openly at one another.</w:t>
       </w:r>
     </w:p>
@@ -10509,6 +11507,19 @@
           <w:sz w:val="24"/>
           <w:szCs w:val="24"/>
         </w:rPr>
+        <w:t xml:space="preserve">290 O HENRY - 100 SELECTED STORIES</w:t>
+      </w:r>
+    </w:p>
+    <w:p>
+      <w:pPr>
+        <w:spacing w:line="240" w:lineRule="exact"/>
+      </w:pPr>
+      <w:r>
+        <w:rPr>
+          <w:rFonts w:ascii="Times New Roman" w:cs="Times New Roman" w:eastAsia="Times New Roman" w:hAnsi="Times New Roman"/>
+          <w:sz w:val="24"/>
+          <w:szCs w:val="24"/>
+        </w:rPr>
         <w:t xml:space="preserve">'Cheese it, old man,' he murmured reproachfully. 'The Central Office must be bughouse to send you out looking like such a gillie. You couldn't get within two blocks of a sidewalk crap game in them Tony Pastor props. The recent Mr. Scotty from Death Valley has got you beat a crosstown block in the way of Elizabethan scenery and mechanical accessories. Let it be skiddoo for yours. Nay, I know of no gilded halls where one may bet a patrol wagon on the ace.'</w:t>
       </w:r>
     </w:p>
@@ -10689,6 +11700,19 @@
           <w:sz w:val="24"/>
           <w:szCs w:val="24"/>
         </w:rPr>
+        <w:t xml:space="preserve">O HENRY - 100 SELECTED STORIES 291</w:t>
+      </w:r>
+    </w:p>
+    <w:p>
+      <w:pPr>
+        <w:spacing w:line="240" w:lineRule="exact"/>
+      </w:pPr>
+      <w:r>
+        <w:rPr>
+          <w:rFonts w:ascii="Times New Roman" w:cs="Times New Roman" w:eastAsia="Times New Roman" w:hAnsi="Times New Roman"/>
+          <w:sz w:val="24"/>
+          <w:szCs w:val="24"/>
+        </w:rPr>
         <w:t xml:space="preserve">The desk sergeant wrung from him the name Jabez Bulltongue, of Locust Valley Farm, Ulster County, and then began to take descriptions of the strong-arm gentlemen.</w:t>
       </w:r>
     </w:p>
@@ -10882,6 +11906,32 @@
           <w:sz w:val="24"/>
           <w:szCs w:val="24"/>
         </w:rPr>
+        <w:t xml:space="preserve">O HENRY - 100 SELECTED STORIES 297</w:t>
+      </w:r>
+    </w:p>
+    <w:p>
+      <w:pPr>
+        <w:spacing w:line="240" w:lineRule="exact"/>
+      </w:pPr>
+      <w:r>
+        <w:rPr>
+          <w:rFonts w:ascii="Times New Roman" w:cs="Times New Roman" w:eastAsia="Times New Roman" w:hAnsi="Times New Roman"/>
+          <w:sz w:val="24"/>
+          <w:szCs w:val="24"/>
+        </w:rPr>
+        <w:t xml:space="preserve">racking, petitionary music of a violin. The hag, music, bewitches some of the noblest. The daws may peck upon one's sleeve without injury, but whoever wears his heart upon his tympanum gets it not far from the neck.</w:t>
+      </w:r>
+    </w:p>
+    <w:p>
+      <w:pPr>
+        <w:spacing w:line="240" w:lineRule="exact"/>
+      </w:pPr>
+      <w:r>
+        <w:rPr>
+          <w:rFonts w:ascii="Times New Roman" w:cs="Times New Roman" w:eastAsia="Times New Roman" w:hAnsi="Times New Roman"/>
+          <w:sz w:val="24"/>
+          <w:szCs w:val="24"/>
+        </w:rPr>
         <w:t xml:space="preserve">This music and the musician called her, and at her side honour and the old love held her back.</w:t>
       </w:r>
     </w:p>
@@ -11075,6 +12125,19 @@
           <w:sz w:val="24"/>
           <w:szCs w:val="24"/>
         </w:rPr>
+        <w:t xml:space="preserve">298 O HENRY - 100 SELECTED STORIES</w:t>
+      </w:r>
+    </w:p>
+    <w:p>
+      <w:pPr>
+        <w:spacing w:line="240" w:lineRule="exact"/>
+      </w:pPr>
+      <w:r>
+        <w:rPr>
+          <w:rFonts w:ascii="Times New Roman" w:cs="Times New Roman" w:eastAsia="Times New Roman" w:hAnsi="Times New Roman"/>
+          <w:sz w:val="24"/>
+          <w:szCs w:val="24"/>
+        </w:rPr>
         <w:t xml:space="preserve">When I set out I had no thought or premonition of what was to occur. The attack came suddenly.</w:t>
       </w:r>
     </w:p>
@@ -11237,6 +12300,19 @@
           <w:sz w:val="24"/>
           <w:szCs w:val="24"/>
         </w:rPr>
+        <w:t xml:space="preserve">O HENRY - 100 SELECTED STORIES 299</w:t>
+      </w:r>
+    </w:p>
+    <w:p>
+      <w:pPr>
+        <w:spacing w:line="240" w:lineRule="exact"/>
+      </w:pPr>
+      <w:r>
+        <w:rPr>
+          <w:rFonts w:ascii="Times New Roman" w:cs="Times New Roman" w:eastAsia="Times New Roman" w:hAnsi="Times New Roman"/>
+          <w:sz w:val="24"/>
+          <w:szCs w:val="24"/>
+        </w:rPr>
         <w:t xml:space="preserve">The car was well crowded with men, among whom I told myself, there must have been some common interest, for they intermingled freely, and seemed in the best good-humour and spirits. One of them - a stout, spectacled gentleman enveloped in a decided odour of cinnamon and aloes - took the vacant half of my seat with a friendly nod, and unfolded a newspaper. In the intervals between his periods of reading, we conversed, as travellers will, on current affairs. I found myself able to sustain the conversation on such subjects with credit, at least to my memory. By and by my companion said:</w:t>
       </w:r>
     </w:p>
@@ -11424,6 +12500,19 @@
       <w:pPr>
         <w:spacing w:line="240" w:lineRule="exact"/>
       </w:pPr>
+    </w:p>
+    <w:p>
+      <w:pPr>
+        <w:spacing w:line="240" w:lineRule="exact"/>
+      </w:pPr>
+      <w:r>
+        <w:rPr>
+          <w:rFonts w:ascii="Times New Roman" w:cs="Times New Roman" w:eastAsia="Times New Roman" w:hAnsi="Times New Roman"/>
+          <w:sz w:val="24"/>
+          <w:szCs w:val="24"/>
+        </w:rPr>
+        <w:t xml:space="preserve">300 O HENRY - 100 SELECTED STORIES</w:t>
+      </w:r>
     </w:p>
     <w:p>
       <w:pPr>
@@ -11597,6 +12686,19 @@
       <w:titlePg/>
       <w:docGrid w:linePitch="360"/>
     </w:sectPr>
+    <w:p>
+      <w:pPr>
+        <w:spacing w:line="240" w:lineRule="exact"/>
+      </w:pPr>
+      <w:r>
+        <w:rPr>
+          <w:rFonts w:ascii="Times New Roman" w:cs="Times New Roman" w:eastAsia="Times New Roman" w:hAnsi="Times New Roman"/>
+          <w:sz w:val="24"/>
+          <w:szCs w:val="24"/>
+        </w:rPr>
+        <w:t xml:space="preserve">O HENRY - 100 SELECTED STORIES 301</w:t>
+      </w:r>
+    </w:p>
   </w:body>
 </w:document>
 </file>

</xml_diff>